<commit_message>
Customer sheet: anchor info and agent blocks above the ledger on one page (no overlap), thinner spacer rows, reset negative indent when filling
Co-Authored-By: Claude Sonnet 5.5 <noreply@anthropic.com>
Claude-Session: https://claude.ai/code/session_01FvsgfPSSL5saKLwduZ7dQu
</commit_message>
<xml_diff>
--- a/customer-monitoring-sheet.docx
+++ b/customer-monitoring-sheet.docx
@@ -79,7 +79,7 @@
     <w:tbl>
       <w:tblPr>
         <w:tblStyle w:val="TableGrid"/>
-        <w:tblpPr w:leftFromText="180" w:rightFromText="180" w:vertAnchor="text" w:horzAnchor="margin" w:tblpX="-289" w:tblpY="3192"/>
+        <w:tblpPr w:leftFromText="180" w:rightFromText="180" w:vertAnchor="page" w:horzAnchor="page" w:tblpX="431" w:tblpY="3950"/>
         <w:tblW w:w="15729" w:type="dxa"/>
         <w:tblLayout w:type="fixed"/>
         <w:tblLook w:val="04A0" w:firstRow="1" w:lastRow="0" w:firstColumn="1" w:lastColumn="0" w:noHBand="0" w:noVBand="1"/>
@@ -5485,7 +5485,7 @@
     <w:tbl>
       <w:tblPr>
         <w:tblStyle w:val="TableGrid"/>
-        <w:tblpPr w:leftFromText="180" w:rightFromText="180" w:vertAnchor="text" w:horzAnchor="margin" w:tblpX="-289" w:tblpY="1044"/>
+        <w:tblpPr w:leftFromText="180" w:rightFromText="180" w:vertAnchor="page" w:horzAnchor="page" w:tblpX="431" w:tblpY="2150"/>
         <w:tblOverlap w:val="never"/>
         <w:tblW w:w="10177" w:type="dxa"/>
         <w:shd w:val="clear" w:color="auto" w:fill="FFFFFF" w:themeFill="background1"/>
@@ -5500,7 +5500,7 @@
       </w:tblGrid>
       <w:tr>
         <w:trPr>
-          <w:trHeight w:val="396"/>
+          <w:trHeight w:val="340"/>
         </w:trPr>
         <w:tc>
           <w:tcPr>
@@ -5635,7 +5635,7 @@
       </w:tr>
       <w:tr>
         <w:trPr>
-          <w:trHeight w:val="396"/>
+          <w:trHeight w:val="340"/>
         </w:trPr>
         <w:tc>
           <w:tcPr>
@@ -5761,7 +5761,7 @@
       </w:tr>
       <w:tr>
         <w:trPr>
-          <w:trHeight w:val="396"/>
+          <w:trHeight w:val="340"/>
         </w:trPr>
         <w:tc>
           <w:tcPr>
@@ -5887,7 +5887,7 @@
       </w:tr>
       <w:tr>
         <w:trPr>
-          <w:trHeight w:val="396"/>
+          <w:trHeight w:val="340"/>
         </w:trPr>
         <w:tc>
           <w:tcPr>
@@ -6013,7 +6013,7 @@
       </w:tr>
       <w:tr>
         <w:trPr>
-          <w:trHeight w:val="396"/>
+          <w:trHeight w:val="340"/>
         </w:trPr>
         <w:tc>
           <w:tcPr>
@@ -6141,7 +6141,7 @@
     <w:tbl>
       <w:tblPr>
         <w:tblStyle w:val="TableGrid"/>
-        <w:tblpPr w:leftFromText="180" w:rightFromText="180" w:vertAnchor="text" w:horzAnchor="page" w:tblpX="8310" w:tblpY="1045"/>
+        <w:tblpPr w:leftFromText="180" w:rightFromText="180" w:vertAnchor="page" w:horzAnchor="page" w:tblpX="10978" w:tblpY="2150"/>
         <w:tblW w:w="0" w:type="auto"/>
         <w:shd w:val="clear" w:color="auto" w:fill="FFFFFF" w:themeFill="background1"/>
         <w:tblLook w:val="04A0" w:firstRow="1" w:lastRow="0" w:firstColumn="1" w:lastColumn="0" w:noHBand="0" w:noVBand="1"/>
@@ -6344,7 +6344,10 @@
           </w:tcPr>
           <w:p>
             <w:pPr>
-              <w:rPr>
+              <w:spacing w:after="0" w:line="240" w:lineRule="auto"/>
+              <w:rPr>
+                <w:sz w:val="4"/>
+                <w:szCs w:val="4"/>
                 <w:rFonts w:ascii="Times New Roman" w:hAnsi="Times New Roman" w:cs="Times New Roman"/>
               </w:rPr>
             </w:pPr>
@@ -6360,7 +6363,10 @@
           </w:tcPr>
           <w:p>
             <w:pPr>
-              <w:rPr>
+              <w:spacing w:after="0" w:line="240" w:lineRule="auto"/>
+              <w:rPr>
+                <w:sz w:val="4"/>
+                <w:szCs w:val="4"/>
                 <w:rFonts w:ascii="Times New Roman" w:hAnsi="Times New Roman" w:cs="Times New Roman"/>
               </w:rPr>
             </w:pPr>
@@ -6373,7 +6379,10 @@
           </w:tcPr>
           <w:p>
             <w:pPr>
-              <w:rPr>
+              <w:spacing w:after="0" w:line="240" w:lineRule="auto"/>
+              <w:rPr>
+                <w:sz w:val="4"/>
+                <w:szCs w:val="4"/>
                 <w:rFonts w:ascii="Times New Roman" w:hAnsi="Times New Roman" w:cs="Times New Roman"/>
               </w:rPr>
             </w:pPr>
@@ -6446,7 +6455,10 @@
           </w:tcPr>
           <w:p>
             <w:pPr>
-              <w:rPr>
+              <w:spacing w:after="0" w:line="240" w:lineRule="auto"/>
+              <w:rPr>
+                <w:sz w:val="4"/>
+                <w:szCs w:val="4"/>
                 <w:rFonts w:ascii="Times New Roman" w:hAnsi="Times New Roman" w:cs="Times New Roman"/>
               </w:rPr>
             </w:pPr>
@@ -6462,7 +6474,10 @@
           </w:tcPr>
           <w:p>
             <w:pPr>
-              <w:rPr>
+              <w:spacing w:after="0" w:line="240" w:lineRule="auto"/>
+              <w:rPr>
+                <w:sz w:val="4"/>
+                <w:szCs w:val="4"/>
                 <w:rFonts w:ascii="Times New Roman" w:hAnsi="Times New Roman" w:cs="Times New Roman"/>
               </w:rPr>
             </w:pPr>
@@ -6475,7 +6490,10 @@
           </w:tcPr>
           <w:p>
             <w:pPr>
-              <w:rPr>
+              <w:spacing w:after="0" w:line="240" w:lineRule="auto"/>
+              <w:rPr>
+                <w:sz w:val="4"/>
+                <w:szCs w:val="4"/>
                 <w:rFonts w:ascii="Times New Roman" w:hAnsi="Times New Roman" w:cs="Times New Roman"/>
               </w:rPr>
             </w:pPr>
@@ -6544,7 +6562,6 @@
         <w:rPr>
           <w:rFonts w:ascii="Times New Roman" w:hAnsi="Times New Roman" w:cs="Times New Roman"/>
         </w:rPr>
-        <w:br w:type="page"/>
       </w:r>
     </w:p>
     <w:sectPr>

</xml_diff>

<commit_message>
Admin: Print sheet button fills the company's envelope sheet; use the updated Word form
Co-Authored-By: Claude Sonnet 5.5 <noreply@anthropic.com>
Claude-Session: https://claude.ai/code/session_01FvsgfPSSL5saKLwduZ7dQu
</commit_message>
<xml_diff>
--- a/customer-monitoring-sheet.docx
+++ b/customer-monitoring-sheet.docx
@@ -79,7 +79,7 @@
     <w:tbl>
       <w:tblPr>
         <w:tblStyle w:val="TableGrid"/>
-        <w:tblpPr w:leftFromText="180" w:rightFromText="180" w:vertAnchor="page" w:horzAnchor="page" w:tblpX="431" w:tblpY="3950"/>
+        <w:tblpPr w:leftFromText="180" w:rightFromText="180" w:vertAnchor="text" w:horzAnchor="margin" w:tblpX="-289" w:tblpY="3192"/>
         <w:tblW w:w="15729" w:type="dxa"/>
         <w:tblLayout w:type="fixed"/>
         <w:tblLook w:val="04A0" w:firstRow="1" w:lastRow="0" w:firstColumn="1" w:lastColumn="0" w:noHBand="0" w:noVBand="1"/>
@@ -5485,7 +5485,7 @@
     <w:tbl>
       <w:tblPr>
         <w:tblStyle w:val="TableGrid"/>
-        <w:tblpPr w:leftFromText="180" w:rightFromText="180" w:vertAnchor="page" w:horzAnchor="page" w:tblpX="431" w:tblpY="2150"/>
+        <w:tblpPr w:leftFromText="180" w:rightFromText="180" w:vertAnchor="text" w:horzAnchor="margin" w:tblpX="-289" w:tblpY="1044"/>
         <w:tblOverlap w:val="never"/>
         <w:tblW w:w="10177" w:type="dxa"/>
         <w:shd w:val="clear" w:color="auto" w:fill="FFFFFF" w:themeFill="background1"/>
@@ -5500,7 +5500,7 @@
       </w:tblGrid>
       <w:tr>
         <w:trPr>
-          <w:trHeight w:val="340"/>
+          <w:trHeight w:val="396"/>
         </w:trPr>
         <w:tc>
           <w:tcPr>
@@ -5635,7 +5635,7 @@
       </w:tr>
       <w:tr>
         <w:trPr>
-          <w:trHeight w:val="340"/>
+          <w:trHeight w:val="396"/>
         </w:trPr>
         <w:tc>
           <w:tcPr>
@@ -5761,7 +5761,7 @@
       </w:tr>
       <w:tr>
         <w:trPr>
-          <w:trHeight w:val="340"/>
+          <w:trHeight w:val="396"/>
         </w:trPr>
         <w:tc>
           <w:tcPr>
@@ -5887,7 +5887,7 @@
       </w:tr>
       <w:tr>
         <w:trPr>
-          <w:trHeight w:val="340"/>
+          <w:trHeight w:val="396"/>
         </w:trPr>
         <w:tc>
           <w:tcPr>
@@ -6013,7 +6013,7 @@
       </w:tr>
       <w:tr>
         <w:trPr>
-          <w:trHeight w:val="340"/>
+          <w:trHeight w:val="396"/>
         </w:trPr>
         <w:tc>
           <w:tcPr>
@@ -6141,7 +6141,7 @@
     <w:tbl>
       <w:tblPr>
         <w:tblStyle w:val="TableGrid"/>
-        <w:tblpPr w:leftFromText="180" w:rightFromText="180" w:vertAnchor="page" w:horzAnchor="page" w:tblpX="10978" w:tblpY="2150"/>
+        <w:tblpPr w:leftFromText="180" w:rightFromText="180" w:vertAnchor="text" w:horzAnchor="page" w:tblpX="8310" w:tblpY="1045"/>
         <w:tblW w:w="0" w:type="auto"/>
         <w:shd w:val="clear" w:color="auto" w:fill="FFFFFF" w:themeFill="background1"/>
         <w:tblLook w:val="04A0" w:firstRow="1" w:lastRow="0" w:firstColumn="1" w:lastColumn="0" w:noHBand="0" w:noVBand="1"/>
@@ -6344,10 +6344,7 @@
           </w:tcPr>
           <w:p>
             <w:pPr>
-              <w:spacing w:after="0" w:line="240" w:lineRule="auto"/>
-              <w:rPr>
-                <w:sz w:val="4"/>
-                <w:szCs w:val="4"/>
+              <w:rPr>
                 <w:rFonts w:ascii="Times New Roman" w:hAnsi="Times New Roman" w:cs="Times New Roman"/>
               </w:rPr>
             </w:pPr>
@@ -6363,10 +6360,7 @@
           </w:tcPr>
           <w:p>
             <w:pPr>
-              <w:spacing w:after="0" w:line="240" w:lineRule="auto"/>
-              <w:rPr>
-                <w:sz w:val="4"/>
-                <w:szCs w:val="4"/>
+              <w:rPr>
                 <w:rFonts w:ascii="Times New Roman" w:hAnsi="Times New Roman" w:cs="Times New Roman"/>
               </w:rPr>
             </w:pPr>
@@ -6379,10 +6373,7 @@
           </w:tcPr>
           <w:p>
             <w:pPr>
-              <w:spacing w:after="0" w:line="240" w:lineRule="auto"/>
-              <w:rPr>
-                <w:sz w:val="4"/>
-                <w:szCs w:val="4"/>
+              <w:rPr>
                 <w:rFonts w:ascii="Times New Roman" w:hAnsi="Times New Roman" w:cs="Times New Roman"/>
               </w:rPr>
             </w:pPr>
@@ -6455,10 +6446,7 @@
           </w:tcPr>
           <w:p>
             <w:pPr>
-              <w:spacing w:after="0" w:line="240" w:lineRule="auto"/>
-              <w:rPr>
-                <w:sz w:val="4"/>
-                <w:szCs w:val="4"/>
+              <w:rPr>
                 <w:rFonts w:ascii="Times New Roman" w:hAnsi="Times New Roman" w:cs="Times New Roman"/>
               </w:rPr>
             </w:pPr>
@@ -6474,10 +6462,7 @@
           </w:tcPr>
           <w:p>
             <w:pPr>
-              <w:spacing w:after="0" w:line="240" w:lineRule="auto"/>
-              <w:rPr>
-                <w:sz w:val="4"/>
-                <w:szCs w:val="4"/>
+              <w:rPr>
                 <w:rFonts w:ascii="Times New Roman" w:hAnsi="Times New Roman" w:cs="Times New Roman"/>
               </w:rPr>
             </w:pPr>
@@ -6490,10 +6475,7 @@
           </w:tcPr>
           <w:p>
             <w:pPr>
-              <w:spacing w:after="0" w:line="240" w:lineRule="auto"/>
-              <w:rPr>
-                <w:sz w:val="4"/>
-                <w:szCs w:val="4"/>
+              <w:rPr>
                 <w:rFonts w:ascii="Times New Roman" w:hAnsi="Times New Roman" w:cs="Times New Roman"/>
               </w:rPr>
             </w:pPr>
@@ -6562,6 +6544,7 @@
         <w:rPr>
           <w:rFonts w:ascii="Times New Roman" w:hAnsi="Times New Roman" w:cs="Times New Roman"/>
         </w:rPr>
+        <w:br w:type="page"/>
       </w:r>
     </w:p>
     <w:sectPr>

</xml_diff>

<commit_message>
Envelope sheet: one page, info boxes side by side above the payment tables
Co-Authored-By: Claude Sonnet 5.5 <noreply@anthropic.com>
Claude-Session: https://claude.ai/code/session_01FvsgfPSSL5saKLwduZ7dQu
</commit_message>
<xml_diff>
--- a/customer-monitoring-sheet.docx
+++ b/customer-monitoring-sheet.docx
@@ -79,7 +79,1059 @@
     <w:tbl>
       <w:tblPr>
         <w:tblStyle w:val="TableGrid"/>
-        <w:tblpPr w:leftFromText="180" w:rightFromText="180" w:vertAnchor="text" w:horzAnchor="margin" w:tblpX="-289" w:tblpY="3192"/>
+        <w:tblpPr w:leftFromText="180" w:rightFromText="180" w:vertAnchor="text" w:horzAnchor="margin" w:tblpX="-289" w:tblpY="1044"/>
+        <w:tblOverlap w:val="never"/>
+        <w:tblW w:w="10177" w:type="dxa"/>
+        <w:shd w:val="clear" w:color="auto" w:fill="FFFFFF" w:themeFill="background1"/>
+        <w:tblLook w:val="04A0" w:firstRow="1" w:lastRow="0" w:firstColumn="1" w:lastColumn="0" w:noHBand="0" w:noVBand="1"/>
+      </w:tblPr>
+      <w:tblGrid>
+        <w:gridCol w:w="2155"/>
+        <w:gridCol w:w="2802"/>
+        <w:gridCol w:w="236"/>
+        <w:gridCol w:w="2104"/>
+        <w:gridCol w:w="2880"/>
+      </w:tblGrid>
+      <w:tr>
+        <w:trPr>
+          <w:trHeight w:val="396"/>
+        </w:trPr>
+        <w:tc>
+          <w:tcPr>
+            <w:tcW w:w="2155" w:type="dxa"/>
+            <w:tcBorders>
+              <w:left w:val="single" w:sz="4" w:space="0" w:color="auto"/>
+              <w:right w:val="nil"/>
+            </w:tcBorders>
+            <w:shd w:val="clear" w:color="auto" w:fill="A8D08D" w:themeFill="accent6" w:themeFillTint="99"/>
+            <w:vAlign w:val="center"/>
+          </w:tcPr>
+          <w:p>
+            <w:pPr>
+              <w:rPr>
+                <w:rFonts w:ascii="Times New Roman" w:hAnsi="Times New Roman" w:cs="Times New Roman"/>
+                <w:b/>
+                <w:bCs/>
+                <w:sz w:val="20"/>
+                <w:szCs w:val="20"/>
+              </w:rPr>
+            </w:pPr>
+            <w:r>
+              <w:rPr>
+                <w:rFonts w:ascii="Times New Roman" w:hAnsi="Times New Roman" w:cs="Times New Roman"/>
+                <w:b/>
+                <w:bCs/>
+                <w:sz w:val="20"/>
+                <w:szCs w:val="20"/>
+              </w:rPr>
+              <w:t>NAME:</w:t>
+            </w:r>
+          </w:p>
+        </w:tc>
+        <w:tc>
+          <w:tcPr>
+            <w:tcW w:w="2802" w:type="dxa"/>
+            <w:tcBorders>
+              <w:left w:val="nil"/>
+              <w:right w:val="single" w:sz="4" w:space="0" w:color="auto"/>
+            </w:tcBorders>
+            <w:shd w:val="clear" w:color="auto" w:fill="FFFFFF" w:themeFill="background1"/>
+            <w:vAlign w:val="center"/>
+          </w:tcPr>
+          <w:p>
+            <w:pPr>
+              <w:rPr>
+                <w:rFonts w:ascii="Times New Roman" w:hAnsi="Times New Roman" w:cs="Times New Roman"/>
+                <w:b/>
+                <w:bCs/>
+              </w:rPr>
+            </w:pPr>
+          </w:p>
+        </w:tc>
+        <w:tc>
+          <w:tcPr>
+            <w:tcW w:w="236" w:type="dxa"/>
+            <w:tcBorders>
+              <w:top w:val="nil"/>
+              <w:left w:val="single" w:sz="4" w:space="0" w:color="auto"/>
+              <w:bottom w:val="nil"/>
+              <w:right w:val="single" w:sz="4" w:space="0" w:color="auto"/>
+            </w:tcBorders>
+            <w:vAlign w:val="center"/>
+          </w:tcPr>
+          <w:p>
+            <w:pPr>
+              <w:rPr>
+                <w:rFonts w:ascii="Times New Roman" w:hAnsi="Times New Roman" w:cs="Times New Roman"/>
+                <w:b/>
+                <w:bCs/>
+              </w:rPr>
+            </w:pPr>
+            <w:r>
+              <w:rPr>
+                <w:rFonts w:ascii="Times New Roman" w:hAnsi="Times New Roman" w:cs="Times New Roman"/>
+                <w:b/>
+                <w:bCs/>
+              </w:rPr>
+              <w:t xml:space="preserve">  </w:t>
+            </w:r>
+          </w:p>
+        </w:tc>
+        <w:tc>
+          <w:tcPr>
+            <w:tcW w:w="2104" w:type="dxa"/>
+            <w:tcBorders>
+              <w:left w:val="single" w:sz="4" w:space="0" w:color="auto"/>
+              <w:right w:val="nil"/>
+            </w:tcBorders>
+            <w:shd w:val="clear" w:color="auto" w:fill="A8D08D" w:themeFill="accent6" w:themeFillTint="99"/>
+            <w:vAlign w:val="center"/>
+          </w:tcPr>
+          <w:p>
+            <w:pPr>
+              <w:rPr>
+                <w:rFonts w:ascii="Times New Roman" w:hAnsi="Times New Roman" w:cs="Times New Roman"/>
+                <w:b/>
+                <w:bCs/>
+              </w:rPr>
+            </w:pPr>
+            <w:r>
+              <w:rPr>
+                <w:rFonts w:ascii="Times New Roman" w:hAnsi="Times New Roman" w:cs="Times New Roman"/>
+                <w:b/>
+                <w:bCs/>
+              </w:rPr>
+              <w:t>CONTACT NO.:</w:t>
+            </w:r>
+          </w:p>
+        </w:tc>
+        <w:tc>
+          <w:tcPr>
+            <w:tcW w:w="2880" w:type="dxa"/>
+            <w:tcBorders>
+              <w:top w:val="single" w:sz="4" w:space="0" w:color="auto"/>
+              <w:left w:val="nil"/>
+              <w:bottom w:val="single" w:sz="4" w:space="0" w:color="auto"/>
+              <w:right w:val="single" w:sz="4" w:space="0" w:color="auto"/>
+            </w:tcBorders>
+            <w:shd w:val="clear" w:color="auto" w:fill="FFFFFF" w:themeFill="background1"/>
+          </w:tcPr>
+          <w:p>
+            <w:pPr>
+              <w:rPr>
+                <w:rFonts w:ascii="Times New Roman" w:hAnsi="Times New Roman" w:cs="Times New Roman"/>
+                <w:b/>
+                <w:bCs/>
+              </w:rPr>
+            </w:pPr>
+          </w:p>
+        </w:tc>
+      </w:tr>
+      <w:tr>
+        <w:trPr>
+          <w:trHeight w:val="396"/>
+        </w:trPr>
+        <w:tc>
+          <w:tcPr>
+            <w:tcW w:w="2155" w:type="dxa"/>
+            <w:tcBorders>
+              <w:left w:val="single" w:sz="4" w:space="0" w:color="auto"/>
+              <w:right w:val="nil"/>
+            </w:tcBorders>
+            <w:shd w:val="clear" w:color="auto" w:fill="A8D08D" w:themeFill="accent6" w:themeFillTint="99"/>
+          </w:tcPr>
+          <w:p>
+            <w:pPr>
+              <w:rPr>
+                <w:rFonts w:ascii="Times New Roman" w:hAnsi="Times New Roman" w:cs="Times New Roman"/>
+                <w:b/>
+                <w:bCs/>
+                <w:sz w:val="20"/>
+                <w:szCs w:val="20"/>
+              </w:rPr>
+            </w:pPr>
+            <w:r>
+              <w:rPr>
+                <w:rFonts w:ascii="Times New Roman" w:hAnsi="Times New Roman" w:cs="Times New Roman"/>
+                <w:b/>
+                <w:bCs/>
+                <w:sz w:val="20"/>
+                <w:szCs w:val="20"/>
+              </w:rPr>
+              <w:t>BLOCK:</w:t>
+            </w:r>
+          </w:p>
+        </w:tc>
+        <w:tc>
+          <w:tcPr>
+            <w:tcW w:w="2802" w:type="dxa"/>
+            <w:tcBorders>
+              <w:left w:val="nil"/>
+              <w:right w:val="single" w:sz="4" w:space="0" w:color="auto"/>
+            </w:tcBorders>
+            <w:shd w:val="clear" w:color="auto" w:fill="FFFFFF" w:themeFill="background1"/>
+            <w:vAlign w:val="center"/>
+          </w:tcPr>
+          <w:p>
+            <w:pPr>
+              <w:rPr>
+                <w:rFonts w:ascii="Times New Roman" w:hAnsi="Times New Roman" w:cs="Times New Roman"/>
+                <w:b/>
+                <w:bCs/>
+              </w:rPr>
+            </w:pPr>
+          </w:p>
+        </w:tc>
+        <w:tc>
+          <w:tcPr>
+            <w:tcW w:w="236" w:type="dxa"/>
+            <w:tcBorders>
+              <w:top w:val="nil"/>
+              <w:left w:val="single" w:sz="4" w:space="0" w:color="auto"/>
+              <w:bottom w:val="nil"/>
+              <w:right w:val="single" w:sz="4" w:space="0" w:color="auto"/>
+            </w:tcBorders>
+            <w:vAlign w:val="center"/>
+          </w:tcPr>
+          <w:p>
+            <w:pPr>
+              <w:rPr>
+                <w:rFonts w:ascii="Times New Roman" w:hAnsi="Times New Roman" w:cs="Times New Roman"/>
+                <w:b/>
+                <w:bCs/>
+              </w:rPr>
+            </w:pPr>
+          </w:p>
+        </w:tc>
+        <w:tc>
+          <w:tcPr>
+            <w:tcW w:w="2104" w:type="dxa"/>
+            <w:tcBorders>
+              <w:left w:val="single" w:sz="4" w:space="0" w:color="auto"/>
+              <w:right w:val="nil"/>
+            </w:tcBorders>
+            <w:shd w:val="clear" w:color="auto" w:fill="A8D08D" w:themeFill="accent6" w:themeFillTint="99"/>
+            <w:vAlign w:val="center"/>
+          </w:tcPr>
+          <w:p>
+            <w:pPr>
+              <w:rPr>
+                <w:rFonts w:ascii="Times New Roman" w:hAnsi="Times New Roman" w:cs="Times New Roman"/>
+                <w:b/>
+                <w:bCs/>
+              </w:rPr>
+            </w:pPr>
+            <w:r>
+              <w:rPr>
+                <w:rFonts w:ascii="Times New Roman" w:hAnsi="Times New Roman" w:cs="Times New Roman"/>
+                <w:b/>
+                <w:bCs/>
+              </w:rPr>
+              <w:t>LOT TYPE:</w:t>
+            </w:r>
+          </w:p>
+        </w:tc>
+        <w:tc>
+          <w:tcPr>
+            <w:tcW w:w="2880" w:type="dxa"/>
+            <w:tcBorders>
+              <w:top w:val="single" w:sz="4" w:space="0" w:color="auto"/>
+              <w:left w:val="nil"/>
+              <w:bottom w:val="single" w:sz="4" w:space="0" w:color="auto"/>
+              <w:right w:val="single" w:sz="4" w:space="0" w:color="auto"/>
+            </w:tcBorders>
+            <w:shd w:val="clear" w:color="auto" w:fill="FFFFFF" w:themeFill="background1"/>
+          </w:tcPr>
+          <w:p>
+            <w:pPr>
+              <w:rPr>
+                <w:rFonts w:ascii="Times New Roman" w:hAnsi="Times New Roman" w:cs="Times New Roman"/>
+                <w:b/>
+                <w:bCs/>
+              </w:rPr>
+            </w:pPr>
+          </w:p>
+        </w:tc>
+      </w:tr>
+      <w:tr>
+        <w:trPr>
+          <w:trHeight w:val="396"/>
+        </w:trPr>
+        <w:tc>
+          <w:tcPr>
+            <w:tcW w:w="2155" w:type="dxa"/>
+            <w:tcBorders>
+              <w:left w:val="single" w:sz="4" w:space="0" w:color="auto"/>
+              <w:right w:val="nil"/>
+            </w:tcBorders>
+            <w:shd w:val="clear" w:color="auto" w:fill="A8D08D" w:themeFill="accent6" w:themeFillTint="99"/>
+          </w:tcPr>
+          <w:p>
+            <w:pPr>
+              <w:rPr>
+                <w:rFonts w:ascii="Times New Roman" w:hAnsi="Times New Roman" w:cs="Times New Roman"/>
+                <w:b/>
+                <w:bCs/>
+                <w:sz w:val="20"/>
+                <w:szCs w:val="20"/>
+              </w:rPr>
+            </w:pPr>
+            <w:r>
+              <w:rPr>
+                <w:rFonts w:ascii="Times New Roman" w:hAnsi="Times New Roman" w:cs="Times New Roman"/>
+                <w:b/>
+                <w:bCs/>
+                <w:sz w:val="20"/>
+                <w:szCs w:val="20"/>
+              </w:rPr>
+              <w:t>LOT NO.:</w:t>
+            </w:r>
+          </w:p>
+        </w:tc>
+        <w:tc>
+          <w:tcPr>
+            <w:tcW w:w="2802" w:type="dxa"/>
+            <w:tcBorders>
+              <w:left w:val="nil"/>
+              <w:right w:val="single" w:sz="4" w:space="0" w:color="auto"/>
+            </w:tcBorders>
+            <w:shd w:val="clear" w:color="auto" w:fill="FFFFFF" w:themeFill="background1"/>
+            <w:vAlign w:val="center"/>
+          </w:tcPr>
+          <w:p>
+            <w:pPr>
+              <w:rPr>
+                <w:rFonts w:ascii="Times New Roman" w:hAnsi="Times New Roman" w:cs="Times New Roman"/>
+                <w:b/>
+                <w:bCs/>
+              </w:rPr>
+            </w:pPr>
+          </w:p>
+        </w:tc>
+        <w:tc>
+          <w:tcPr>
+            <w:tcW w:w="236" w:type="dxa"/>
+            <w:tcBorders>
+              <w:top w:val="nil"/>
+              <w:left w:val="single" w:sz="4" w:space="0" w:color="auto"/>
+              <w:bottom w:val="nil"/>
+              <w:right w:val="single" w:sz="4" w:space="0" w:color="auto"/>
+            </w:tcBorders>
+            <w:vAlign w:val="center"/>
+          </w:tcPr>
+          <w:p>
+            <w:pPr>
+              <w:rPr>
+                <w:rFonts w:ascii="Times New Roman" w:hAnsi="Times New Roman" w:cs="Times New Roman"/>
+                <w:b/>
+                <w:bCs/>
+              </w:rPr>
+            </w:pPr>
+          </w:p>
+        </w:tc>
+        <w:tc>
+          <w:tcPr>
+            <w:tcW w:w="2104" w:type="dxa"/>
+            <w:tcBorders>
+              <w:left w:val="single" w:sz="4" w:space="0" w:color="auto"/>
+              <w:right w:val="nil"/>
+            </w:tcBorders>
+            <w:shd w:val="clear" w:color="auto" w:fill="A8D08D" w:themeFill="accent6" w:themeFillTint="99"/>
+            <w:vAlign w:val="center"/>
+          </w:tcPr>
+          <w:p>
+            <w:pPr>
+              <w:rPr>
+                <w:rFonts w:ascii="Times New Roman" w:hAnsi="Times New Roman" w:cs="Times New Roman"/>
+                <w:b/>
+                <w:bCs/>
+              </w:rPr>
+            </w:pPr>
+            <w:r>
+              <w:rPr>
+                <w:rFonts w:ascii="Times New Roman" w:hAnsi="Times New Roman" w:cs="Times New Roman"/>
+                <w:b/>
+                <w:bCs/>
+              </w:rPr>
+              <w:t>PHASE NO.:</w:t>
+            </w:r>
+          </w:p>
+        </w:tc>
+        <w:tc>
+          <w:tcPr>
+            <w:tcW w:w="2880" w:type="dxa"/>
+            <w:tcBorders>
+              <w:top w:val="single" w:sz="4" w:space="0" w:color="auto"/>
+              <w:left w:val="nil"/>
+              <w:bottom w:val="single" w:sz="4" w:space="0" w:color="auto"/>
+              <w:right w:val="single" w:sz="4" w:space="0" w:color="auto"/>
+            </w:tcBorders>
+            <w:shd w:val="clear" w:color="auto" w:fill="FFFFFF" w:themeFill="background1"/>
+          </w:tcPr>
+          <w:p>
+            <w:pPr>
+              <w:rPr>
+                <w:rFonts w:ascii="Times New Roman" w:hAnsi="Times New Roman" w:cs="Times New Roman"/>
+                <w:b/>
+                <w:bCs/>
+              </w:rPr>
+            </w:pPr>
+          </w:p>
+        </w:tc>
+      </w:tr>
+      <w:tr>
+        <w:trPr>
+          <w:trHeight w:val="396"/>
+        </w:trPr>
+        <w:tc>
+          <w:tcPr>
+            <w:tcW w:w="2155" w:type="dxa"/>
+            <w:tcBorders>
+              <w:left w:val="single" w:sz="4" w:space="0" w:color="auto"/>
+              <w:right w:val="nil"/>
+            </w:tcBorders>
+            <w:shd w:val="clear" w:color="auto" w:fill="A8D08D" w:themeFill="accent6" w:themeFillTint="99"/>
+          </w:tcPr>
+          <w:p>
+            <w:pPr>
+              <w:rPr>
+                <w:rFonts w:ascii="Times New Roman" w:hAnsi="Times New Roman" w:cs="Times New Roman"/>
+                <w:b/>
+                <w:bCs/>
+                <w:sz w:val="20"/>
+                <w:szCs w:val="20"/>
+              </w:rPr>
+            </w:pPr>
+            <w:r>
+              <w:rPr>
+                <w:rFonts w:ascii="Times New Roman" w:hAnsi="Times New Roman" w:cs="Times New Roman"/>
+                <w:b/>
+                <w:bCs/>
+                <w:sz w:val="20"/>
+                <w:szCs w:val="20"/>
+              </w:rPr>
+              <w:t>CONTRACT PRICE:</w:t>
+            </w:r>
+          </w:p>
+        </w:tc>
+        <w:tc>
+          <w:tcPr>
+            <w:tcW w:w="2802" w:type="dxa"/>
+            <w:tcBorders>
+              <w:left w:val="nil"/>
+              <w:right w:val="single" w:sz="4" w:space="0" w:color="auto"/>
+            </w:tcBorders>
+            <w:shd w:val="clear" w:color="auto" w:fill="FFFFFF" w:themeFill="background1"/>
+            <w:vAlign w:val="center"/>
+          </w:tcPr>
+          <w:p>
+            <w:pPr>
+              <w:rPr>
+                <w:rFonts w:ascii="Times New Roman" w:hAnsi="Times New Roman" w:cs="Times New Roman"/>
+                <w:b/>
+                <w:bCs/>
+              </w:rPr>
+            </w:pPr>
+          </w:p>
+        </w:tc>
+        <w:tc>
+          <w:tcPr>
+            <w:tcW w:w="236" w:type="dxa"/>
+            <w:tcBorders>
+              <w:top w:val="nil"/>
+              <w:left w:val="single" w:sz="4" w:space="0" w:color="auto"/>
+              <w:bottom w:val="nil"/>
+              <w:right w:val="single" w:sz="4" w:space="0" w:color="auto"/>
+            </w:tcBorders>
+            <w:vAlign w:val="center"/>
+          </w:tcPr>
+          <w:p>
+            <w:pPr>
+              <w:rPr>
+                <w:rFonts w:ascii="Times New Roman" w:hAnsi="Times New Roman" w:cs="Times New Roman"/>
+                <w:b/>
+                <w:bCs/>
+              </w:rPr>
+            </w:pPr>
+          </w:p>
+        </w:tc>
+        <w:tc>
+          <w:tcPr>
+            <w:tcW w:w="2104" w:type="dxa"/>
+            <w:tcBorders>
+              <w:left w:val="single" w:sz="4" w:space="0" w:color="auto"/>
+              <w:right w:val="nil"/>
+            </w:tcBorders>
+            <w:shd w:val="clear" w:color="auto" w:fill="A8D08D" w:themeFill="accent6" w:themeFillTint="99"/>
+            <w:vAlign w:val="center"/>
+          </w:tcPr>
+          <w:p>
+            <w:pPr>
+              <w:rPr>
+                <w:rFonts w:ascii="Times New Roman" w:hAnsi="Times New Roman" w:cs="Times New Roman"/>
+                <w:b/>
+                <w:bCs/>
+              </w:rPr>
+            </w:pPr>
+            <w:r>
+              <w:rPr>
+                <w:rFonts w:ascii="Times New Roman" w:hAnsi="Times New Roman" w:cs="Times New Roman"/>
+                <w:b/>
+                <w:bCs/>
+              </w:rPr>
+              <w:t>YEAR CONRACT:</w:t>
+            </w:r>
+          </w:p>
+        </w:tc>
+        <w:tc>
+          <w:tcPr>
+            <w:tcW w:w="2880" w:type="dxa"/>
+            <w:tcBorders>
+              <w:top w:val="single" w:sz="4" w:space="0" w:color="auto"/>
+              <w:left w:val="nil"/>
+              <w:bottom w:val="single" w:sz="4" w:space="0" w:color="auto"/>
+              <w:right w:val="single" w:sz="4" w:space="0" w:color="auto"/>
+            </w:tcBorders>
+            <w:shd w:val="clear" w:color="auto" w:fill="FFFFFF" w:themeFill="background1"/>
+          </w:tcPr>
+          <w:p>
+            <w:pPr>
+              <w:rPr>
+                <w:rFonts w:ascii="Times New Roman" w:hAnsi="Times New Roman" w:cs="Times New Roman"/>
+                <w:b/>
+                <w:bCs/>
+              </w:rPr>
+            </w:pPr>
+          </w:p>
+        </w:tc>
+      </w:tr>
+      <w:tr>
+        <w:trPr>
+          <w:trHeight w:val="396"/>
+        </w:trPr>
+        <w:tc>
+          <w:tcPr>
+            <w:tcW w:w="2155" w:type="dxa"/>
+            <w:tcBorders>
+              <w:left w:val="single" w:sz="4" w:space="0" w:color="auto"/>
+              <w:right w:val="nil"/>
+            </w:tcBorders>
+            <w:shd w:val="clear" w:color="auto" w:fill="A8D08D" w:themeFill="accent6" w:themeFillTint="99"/>
+          </w:tcPr>
+          <w:p>
+            <w:pPr>
+              <w:rPr>
+                <w:rFonts w:ascii="Times New Roman" w:hAnsi="Times New Roman" w:cs="Times New Roman"/>
+                <w:b/>
+                <w:bCs/>
+                <w:sz w:val="20"/>
+                <w:szCs w:val="20"/>
+              </w:rPr>
+            </w:pPr>
+            <w:r>
+              <w:rPr>
+                <w:rFonts w:ascii="Times New Roman" w:hAnsi="Times New Roman" w:cs="Times New Roman"/>
+                <w:b/>
+                <w:bCs/>
+                <w:sz w:val="20"/>
+                <w:szCs w:val="20"/>
+              </w:rPr>
+              <w:t>DATE:</w:t>
+            </w:r>
+          </w:p>
+        </w:tc>
+        <w:tc>
+          <w:tcPr>
+            <w:tcW w:w="2802" w:type="dxa"/>
+            <w:tcBorders>
+              <w:left w:val="nil"/>
+              <w:right w:val="single" w:sz="4" w:space="0" w:color="auto"/>
+            </w:tcBorders>
+            <w:shd w:val="clear" w:color="auto" w:fill="FFFFFF" w:themeFill="background1"/>
+            <w:vAlign w:val="center"/>
+          </w:tcPr>
+          <w:p>
+            <w:pPr>
+              <w:rPr>
+                <w:rFonts w:ascii="Times New Roman" w:hAnsi="Times New Roman" w:cs="Times New Roman"/>
+                <w:b/>
+                <w:bCs/>
+              </w:rPr>
+            </w:pPr>
+          </w:p>
+        </w:tc>
+        <w:tc>
+          <w:tcPr>
+            <w:tcW w:w="236" w:type="dxa"/>
+            <w:tcBorders>
+              <w:top w:val="nil"/>
+              <w:left w:val="single" w:sz="4" w:space="0" w:color="auto"/>
+              <w:bottom w:val="nil"/>
+              <w:right w:val="single" w:sz="4" w:space="0" w:color="auto"/>
+            </w:tcBorders>
+            <w:vAlign w:val="center"/>
+          </w:tcPr>
+          <w:p>
+            <w:pPr>
+              <w:rPr>
+                <w:rFonts w:ascii="Times New Roman" w:hAnsi="Times New Roman" w:cs="Times New Roman"/>
+                <w:b/>
+                <w:bCs/>
+              </w:rPr>
+            </w:pPr>
+          </w:p>
+        </w:tc>
+        <w:tc>
+          <w:tcPr>
+            <w:tcW w:w="2104" w:type="dxa"/>
+            <w:tcBorders>
+              <w:left w:val="single" w:sz="4" w:space="0" w:color="auto"/>
+              <w:right w:val="nil"/>
+            </w:tcBorders>
+            <w:shd w:val="clear" w:color="auto" w:fill="A8D08D" w:themeFill="accent6" w:themeFillTint="99"/>
+            <w:vAlign w:val="center"/>
+          </w:tcPr>
+          <w:p>
+            <w:pPr>
+              <w:rPr>
+                <w:rFonts w:ascii="Times New Roman" w:hAnsi="Times New Roman" w:cs="Times New Roman"/>
+                <w:b/>
+                <w:bCs/>
+              </w:rPr>
+            </w:pPr>
+            <w:r>
+              <w:rPr>
+                <w:rFonts w:ascii="Times New Roman" w:hAnsi="Times New Roman" w:cs="Times New Roman"/>
+                <w:b/>
+                <w:bCs/>
+              </w:rPr>
+              <w:t>AMOUNT:</w:t>
+            </w:r>
+          </w:p>
+        </w:tc>
+        <w:tc>
+          <w:tcPr>
+            <w:tcW w:w="2880" w:type="dxa"/>
+            <w:tcBorders>
+              <w:top w:val="single" w:sz="4" w:space="0" w:color="auto"/>
+              <w:left w:val="nil"/>
+              <w:bottom w:val="single" w:sz="4" w:space="0" w:color="auto"/>
+              <w:right w:val="single" w:sz="4" w:space="0" w:color="auto"/>
+            </w:tcBorders>
+            <w:shd w:val="clear" w:color="auto" w:fill="FFFFFF" w:themeFill="background1"/>
+          </w:tcPr>
+          <w:p>
+            <w:pPr>
+              <w:rPr>
+                <w:rFonts w:ascii="Times New Roman" w:hAnsi="Times New Roman" w:cs="Times New Roman"/>
+                <w:b/>
+                <w:bCs/>
+              </w:rPr>
+            </w:pPr>
+          </w:p>
+        </w:tc>
+      </w:tr>
+    </w:tbl>
+    <w:tbl>
+      <w:tblPr>
+        <w:tblStyle w:val="TableGrid"/>
+        <w:tblpPr w:leftFromText="180" w:rightFromText="180" w:vertAnchor="text" w:horzAnchor="page" w:tblpX="10880" w:tblpY="650"/>
+        <w:tblW w:w="0" w:type="auto"/>
+        <w:shd w:val="clear" w:color="auto" w:fill="FFFFFF" w:themeFill="background1"/>
+        <w:tblLook w:val="04A0" w:firstRow="1" w:lastRow="0" w:firstColumn="1" w:lastColumn="0" w:noHBand="0" w:noVBand="1"/>
+      </w:tblPr>
+      <w:tblGrid>
+        <w:gridCol w:w="1762"/>
+        <w:gridCol w:w="1980"/>
+        <w:gridCol w:w="1440"/>
+      </w:tblGrid>
+      <w:tr>
+        <w:trPr>
+          <w:trHeight w:val="300"/>
+        </w:trPr>
+        <w:tc>
+          <w:tcPr>
+            <w:tcW w:w="1762" w:type="dxa"/>
+            <w:tcBorders>
+              <w:left w:val="single" w:sz="4" w:space="0" w:color="auto"/>
+              <w:right w:val="nil"/>
+            </w:tcBorders>
+            <w:shd w:val="clear" w:color="auto" w:fill="A8D08D" w:themeFill="accent6" w:themeFillTint="99"/>
+          </w:tcPr>
+          <w:p>
+            <w:pPr>
+              <w:rPr>
+                <w:rFonts w:ascii="Times New Roman" w:hAnsi="Times New Roman" w:cs="Times New Roman"/>
+                <w:b/>
+                <w:bCs/>
+              </w:rPr>
+            </w:pPr>
+            <w:r>
+              <w:rPr>
+                <w:rFonts w:ascii="Times New Roman" w:hAnsi="Times New Roman" w:cs="Times New Roman"/>
+                <w:b/>
+                <w:bCs/>
+              </w:rPr>
+              <w:t>AGENT:</w:t>
+            </w:r>
+          </w:p>
+        </w:tc>
+        <w:tc>
+          <w:tcPr>
+            <w:tcW w:w="3420" w:type="dxa"/>
+            <w:gridSpan w:val="2"/>
+            <w:tcBorders>
+              <w:left w:val="nil"/>
+            </w:tcBorders>
+            <w:shd w:val="clear" w:color="auto" w:fill="FFFFFF" w:themeFill="background1"/>
+          </w:tcPr>
+          <w:p>
+            <w:pPr>
+              <w:rPr>
+                <w:rFonts w:ascii="Times New Roman" w:hAnsi="Times New Roman" w:cs="Times New Roman"/>
+                <w:b/>
+                <w:bCs/>
+              </w:rPr>
+            </w:pPr>
+          </w:p>
+        </w:tc>
+      </w:tr>
+      <w:tr>
+        <w:trPr>
+          <w:trHeight w:val="136"/>
+        </w:trPr>
+        <w:tc>
+          <w:tcPr>
+            <w:tcW w:w="1762" w:type="dxa"/>
+            <w:tcBorders>
+              <w:left w:val="single" w:sz="4" w:space="0" w:color="auto"/>
+              <w:right w:val="single" w:sz="4" w:space="0" w:color="auto"/>
+            </w:tcBorders>
+            <w:shd w:val="clear" w:color="auto" w:fill="FFFFFF" w:themeFill="background1"/>
+          </w:tcPr>
+          <w:p>
+            <w:pPr>
+              <w:jc w:val="center"/>
+              <w:rPr>
+                <w:rFonts w:ascii="Times New Roman" w:hAnsi="Times New Roman" w:cs="Times New Roman"/>
+              </w:rPr>
+            </w:pPr>
+            <w:r>
+              <w:rPr>
+                <w:rFonts w:ascii="Times New Roman" w:hAnsi="Times New Roman" w:cs="Times New Roman"/>
+              </w:rPr>
+              <w:t>Date:</w:t>
+            </w:r>
+          </w:p>
+        </w:tc>
+        <w:tc>
+          <w:tcPr>
+            <w:tcW w:w="1980" w:type="dxa"/>
+            <w:tcBorders>
+              <w:left w:val="single" w:sz="4" w:space="0" w:color="auto"/>
+            </w:tcBorders>
+            <w:shd w:val="clear" w:color="auto" w:fill="FFFFFF" w:themeFill="background1"/>
+          </w:tcPr>
+          <w:p>
+            <w:pPr>
+              <w:jc w:val="center"/>
+              <w:rPr>
+                <w:rFonts w:ascii="Times New Roman" w:hAnsi="Times New Roman" w:cs="Times New Roman"/>
+              </w:rPr>
+            </w:pPr>
+            <w:r>
+              <w:rPr>
+                <w:rFonts w:ascii="Times New Roman" w:hAnsi="Times New Roman" w:cs="Times New Roman"/>
+              </w:rPr>
+              <w:t>Commission:</w:t>
+            </w:r>
+          </w:p>
+        </w:tc>
+        <w:tc>
+          <w:tcPr>
+            <w:tcW w:w="1440" w:type="dxa"/>
+            <w:shd w:val="clear" w:color="auto" w:fill="FFFFFF" w:themeFill="background1"/>
+          </w:tcPr>
+          <w:p>
+            <w:pPr>
+              <w:jc w:val="center"/>
+              <w:rPr>
+                <w:rFonts w:ascii="Times New Roman" w:hAnsi="Times New Roman" w:cs="Times New Roman"/>
+              </w:rPr>
+            </w:pPr>
+            <w:r>
+              <w:rPr>
+                <w:rFonts w:ascii="Times New Roman" w:hAnsi="Times New Roman" w:cs="Times New Roman"/>
+              </w:rPr>
+              <w:t>Signature</w:t>
+            </w:r>
+          </w:p>
+        </w:tc>
+      </w:tr>
+      <w:tr>
+        <w:trPr>
+          <w:trHeight w:val="308"/>
+        </w:trPr>
+        <w:tc>
+          <w:tcPr>
+            <w:tcW w:w="1762" w:type="dxa"/>
+            <w:tcBorders>
+              <w:left w:val="single" w:sz="4" w:space="0" w:color="auto"/>
+              <w:right w:val="single" w:sz="4" w:space="0" w:color="auto"/>
+            </w:tcBorders>
+            <w:shd w:val="clear" w:color="auto" w:fill="FFFFFF" w:themeFill="background1"/>
+          </w:tcPr>
+          <w:p>
+            <w:pPr>
+              <w:tabs>
+                <w:tab w:val="left" w:pos="69"/>
+              </w:tabs>
+              <w:ind w:left="-291" w:firstLine="33"/>
+              <w:rPr>
+                <w:rFonts w:ascii="Times New Roman" w:hAnsi="Times New Roman" w:cs="Times New Roman"/>
+              </w:rPr>
+            </w:pPr>
+          </w:p>
+        </w:tc>
+        <w:tc>
+          <w:tcPr>
+            <w:tcW w:w="1980" w:type="dxa"/>
+            <w:tcBorders>
+              <w:left w:val="single" w:sz="4" w:space="0" w:color="auto"/>
+            </w:tcBorders>
+            <w:shd w:val="clear" w:color="auto" w:fill="FFFFFF" w:themeFill="background1"/>
+          </w:tcPr>
+          <w:p>
+            <w:pPr>
+              <w:rPr>
+                <w:rFonts w:ascii="Times New Roman" w:hAnsi="Times New Roman" w:cs="Times New Roman"/>
+              </w:rPr>
+            </w:pPr>
+          </w:p>
+        </w:tc>
+        <w:tc>
+          <w:tcPr>
+            <w:tcW w:w="1440" w:type="dxa"/>
+            <w:shd w:val="clear" w:color="auto" w:fill="FFFFFF" w:themeFill="background1"/>
+          </w:tcPr>
+          <w:p>
+            <w:pPr>
+              <w:rPr>
+                <w:rFonts w:ascii="Times New Roman" w:hAnsi="Times New Roman" w:cs="Times New Roman"/>
+              </w:rPr>
+            </w:pPr>
+          </w:p>
+        </w:tc>
+      </w:tr>
+      <w:tr>
+        <w:trPr>
+          <w:trHeight w:val="43"/>
+        </w:trPr>
+        <w:tc>
+          <w:tcPr>
+            <w:tcW w:w="1762" w:type="dxa"/>
+            <w:tcBorders>
+              <w:left w:val="single" w:sz="4" w:space="0" w:color="auto"/>
+              <w:right w:val="single" w:sz="4" w:space="0" w:color="auto"/>
+            </w:tcBorders>
+            <w:shd w:val="clear" w:color="auto" w:fill="FFFFFF" w:themeFill="background1"/>
+          </w:tcPr>
+          <w:p>
+            <w:pPr>
+              <w:rPr>
+                <w:rFonts w:ascii="Times New Roman" w:hAnsi="Times New Roman" w:cs="Times New Roman"/>
+              </w:rPr>
+            </w:pPr>
+          </w:p>
+        </w:tc>
+        <w:tc>
+          <w:tcPr>
+            <w:tcW w:w="1980" w:type="dxa"/>
+            <w:tcBorders>
+              <w:left w:val="single" w:sz="4" w:space="0" w:color="auto"/>
+            </w:tcBorders>
+            <w:shd w:val="clear" w:color="auto" w:fill="FFFFFF" w:themeFill="background1"/>
+          </w:tcPr>
+          <w:p>
+            <w:pPr>
+              <w:rPr>
+                <w:rFonts w:ascii="Times New Roman" w:hAnsi="Times New Roman" w:cs="Times New Roman"/>
+              </w:rPr>
+            </w:pPr>
+          </w:p>
+        </w:tc>
+        <w:tc>
+          <w:tcPr>
+            <w:tcW w:w="1440" w:type="dxa"/>
+            <w:shd w:val="clear" w:color="auto" w:fill="FFFFFF" w:themeFill="background1"/>
+          </w:tcPr>
+          <w:p>
+            <w:pPr>
+              <w:rPr>
+                <w:rFonts w:ascii="Times New Roman" w:hAnsi="Times New Roman" w:cs="Times New Roman"/>
+              </w:rPr>
+            </w:pPr>
+          </w:p>
+        </w:tc>
+      </w:tr>
+      <w:tr>
+        <w:trPr>
+          <w:trHeight w:val="164"/>
+        </w:trPr>
+        <w:tc>
+          <w:tcPr>
+            <w:tcW w:w="1762" w:type="dxa"/>
+            <w:tcBorders>
+              <w:left w:val="single" w:sz="4" w:space="0" w:color="auto"/>
+              <w:right w:val="nil"/>
+            </w:tcBorders>
+            <w:shd w:val="clear" w:color="auto" w:fill="A8D08D" w:themeFill="accent6" w:themeFillTint="99"/>
+          </w:tcPr>
+          <w:p>
+            <w:pPr>
+              <w:rPr>
+                <w:rFonts w:ascii="Times New Roman" w:hAnsi="Times New Roman" w:cs="Times New Roman"/>
+                <w:b/>
+                <w:bCs/>
+              </w:rPr>
+            </w:pPr>
+            <w:r>
+              <w:rPr>
+                <w:rFonts w:ascii="Times New Roman" w:hAnsi="Times New Roman" w:cs="Times New Roman"/>
+                <w:b/>
+                <w:bCs/>
+              </w:rPr>
+              <w:t>BROKER:</w:t>
+            </w:r>
+          </w:p>
+        </w:tc>
+        <w:tc>
+          <w:tcPr>
+            <w:tcW w:w="3420" w:type="dxa"/>
+            <w:gridSpan w:val="2"/>
+            <w:tcBorders>
+              <w:left w:val="nil"/>
+            </w:tcBorders>
+            <w:shd w:val="clear" w:color="auto" w:fill="FFFFFF" w:themeFill="background1"/>
+          </w:tcPr>
+          <w:p>
+            <w:pPr>
+              <w:rPr>
+                <w:rFonts w:ascii="Times New Roman" w:hAnsi="Times New Roman" w:cs="Times New Roman"/>
+                <w:b/>
+                <w:bCs/>
+              </w:rPr>
+            </w:pPr>
+          </w:p>
+        </w:tc>
+      </w:tr>
+      <w:tr>
+        <w:trPr>
+          <w:trHeight w:val="43"/>
+        </w:trPr>
+        <w:tc>
+          <w:tcPr>
+            <w:tcW w:w="1762" w:type="dxa"/>
+            <w:tcBorders>
+              <w:left w:val="single" w:sz="4" w:space="0" w:color="auto"/>
+              <w:right w:val="single" w:sz="4" w:space="0" w:color="auto"/>
+            </w:tcBorders>
+            <w:shd w:val="clear" w:color="auto" w:fill="FFFFFF" w:themeFill="background1"/>
+          </w:tcPr>
+          <w:p>
+            <w:pPr>
+              <w:rPr>
+                <w:rFonts w:ascii="Times New Roman" w:hAnsi="Times New Roman" w:cs="Times New Roman"/>
+              </w:rPr>
+            </w:pPr>
+          </w:p>
+        </w:tc>
+        <w:tc>
+          <w:tcPr>
+            <w:tcW w:w="1980" w:type="dxa"/>
+            <w:tcBorders>
+              <w:left w:val="single" w:sz="4" w:space="0" w:color="auto"/>
+            </w:tcBorders>
+            <w:shd w:val="clear" w:color="auto" w:fill="FFFFFF" w:themeFill="background1"/>
+          </w:tcPr>
+          <w:p>
+            <w:pPr>
+              <w:rPr>
+                <w:rFonts w:ascii="Times New Roman" w:hAnsi="Times New Roman" w:cs="Times New Roman"/>
+              </w:rPr>
+            </w:pPr>
+          </w:p>
+        </w:tc>
+        <w:tc>
+          <w:tcPr>
+            <w:tcW w:w="1440" w:type="dxa"/>
+            <w:shd w:val="clear" w:color="auto" w:fill="FFFFFF" w:themeFill="background1"/>
+          </w:tcPr>
+          <w:p>
+            <w:pPr>
+              <w:rPr>
+                <w:rFonts w:ascii="Times New Roman" w:hAnsi="Times New Roman" w:cs="Times New Roman"/>
+              </w:rPr>
+            </w:pPr>
+          </w:p>
+        </w:tc>
+      </w:tr>
+      <w:tr>
+        <w:trPr>
+          <w:trHeight w:val="297"/>
+        </w:trPr>
+        <w:tc>
+          <w:tcPr>
+            <w:tcW w:w="1762" w:type="dxa"/>
+            <w:tcBorders>
+              <w:left w:val="single" w:sz="4" w:space="0" w:color="auto"/>
+              <w:right w:val="single" w:sz="4" w:space="0" w:color="auto"/>
+            </w:tcBorders>
+            <w:shd w:val="clear" w:color="auto" w:fill="FFFFFF" w:themeFill="background1"/>
+          </w:tcPr>
+          <w:p>
+            <w:pPr>
+              <w:rPr>
+                <w:rFonts w:ascii="Times New Roman" w:hAnsi="Times New Roman" w:cs="Times New Roman"/>
+              </w:rPr>
+            </w:pPr>
+          </w:p>
+        </w:tc>
+        <w:tc>
+          <w:tcPr>
+            <w:tcW w:w="1980" w:type="dxa"/>
+            <w:tcBorders>
+              <w:left w:val="single" w:sz="4" w:space="0" w:color="auto"/>
+            </w:tcBorders>
+            <w:shd w:val="clear" w:color="auto" w:fill="FFFFFF" w:themeFill="background1"/>
+          </w:tcPr>
+          <w:p>
+            <w:pPr>
+              <w:rPr>
+                <w:rFonts w:ascii="Times New Roman" w:hAnsi="Times New Roman" w:cs="Times New Roman"/>
+              </w:rPr>
+            </w:pPr>
+          </w:p>
+        </w:tc>
+        <w:tc>
+          <w:tcPr>
+            <w:tcW w:w="1440" w:type="dxa"/>
+            <w:shd w:val="clear" w:color="auto" w:fill="FFFFFF" w:themeFill="background1"/>
+          </w:tcPr>
+          <w:p>
+            <w:pPr>
+              <w:rPr>
+                <w:rFonts w:ascii="Times New Roman" w:hAnsi="Times New Roman" w:cs="Times New Roman"/>
+              </w:rPr>
+            </w:pPr>
+          </w:p>
+        </w:tc>
+      </w:tr>
+    </w:tbl>
+    <w:tbl>
+      <w:tblPr>
+        <w:tblStyle w:val="TableGrid"/>
+        <w:tblpPr w:leftFromText="180" w:rightFromText="180" w:vertAnchor="text" w:horzAnchor="margin" w:tblpX="-289" w:tblpY="2300"/>
         <w:tblW w:w="15729" w:type="dxa"/>
         <w:tblLayout w:type="fixed"/>
         <w:tblLook w:val="04A0" w:firstRow="1" w:lastRow="0" w:firstColumn="1" w:lastColumn="0" w:noHBand="0" w:noVBand="1"/>
@@ -5482,1070 +6534,14 @@
         </w:tc>
       </w:tr>
     </w:tbl>
-    <w:tbl>
-      <w:tblPr>
-        <w:tblStyle w:val="TableGrid"/>
-        <w:tblpPr w:leftFromText="180" w:rightFromText="180" w:vertAnchor="text" w:horzAnchor="margin" w:tblpX="-289" w:tblpY="1044"/>
-        <w:tblOverlap w:val="never"/>
-        <w:tblW w:w="10177" w:type="dxa"/>
-        <w:shd w:val="clear" w:color="auto" w:fill="FFFFFF" w:themeFill="background1"/>
-        <w:tblLook w:val="04A0" w:firstRow="1" w:lastRow="0" w:firstColumn="1" w:lastColumn="0" w:noHBand="0" w:noVBand="1"/>
-      </w:tblPr>
-      <w:tblGrid>
-        <w:gridCol w:w="2155"/>
-        <w:gridCol w:w="2802"/>
-        <w:gridCol w:w="236"/>
-        <w:gridCol w:w="2104"/>
-        <w:gridCol w:w="2880"/>
-      </w:tblGrid>
-      <w:tr>
-        <w:trPr>
-          <w:trHeight w:val="396"/>
-        </w:trPr>
-        <w:tc>
-          <w:tcPr>
-            <w:tcW w:w="2155" w:type="dxa"/>
-            <w:tcBorders>
-              <w:left w:val="single" w:sz="4" w:space="0" w:color="auto"/>
-              <w:right w:val="nil"/>
-            </w:tcBorders>
-            <w:shd w:val="clear" w:color="auto" w:fill="A8D08D" w:themeFill="accent6" w:themeFillTint="99"/>
-            <w:vAlign w:val="center"/>
-          </w:tcPr>
-          <w:p>
-            <w:pPr>
-              <w:rPr>
-                <w:rFonts w:ascii="Times New Roman" w:hAnsi="Times New Roman" w:cs="Times New Roman"/>
-                <w:b/>
-                <w:bCs/>
-                <w:sz w:val="20"/>
-                <w:szCs w:val="20"/>
-              </w:rPr>
-            </w:pPr>
-            <w:r>
-              <w:rPr>
-                <w:rFonts w:ascii="Times New Roman" w:hAnsi="Times New Roman" w:cs="Times New Roman"/>
-                <w:b/>
-                <w:bCs/>
-                <w:sz w:val="20"/>
-                <w:szCs w:val="20"/>
-              </w:rPr>
-              <w:t>NAME:</w:t>
-            </w:r>
-          </w:p>
-        </w:tc>
-        <w:tc>
-          <w:tcPr>
-            <w:tcW w:w="2802" w:type="dxa"/>
-            <w:tcBorders>
-              <w:left w:val="nil"/>
-              <w:right w:val="single" w:sz="4" w:space="0" w:color="auto"/>
-            </w:tcBorders>
-            <w:shd w:val="clear" w:color="auto" w:fill="FFFFFF" w:themeFill="background1"/>
-            <w:vAlign w:val="center"/>
-          </w:tcPr>
-          <w:p>
-            <w:pPr>
-              <w:rPr>
-                <w:rFonts w:ascii="Times New Roman" w:hAnsi="Times New Roman" w:cs="Times New Roman"/>
-                <w:b/>
-                <w:bCs/>
-              </w:rPr>
-            </w:pPr>
-          </w:p>
-        </w:tc>
-        <w:tc>
-          <w:tcPr>
-            <w:tcW w:w="236" w:type="dxa"/>
-            <w:tcBorders>
-              <w:top w:val="nil"/>
-              <w:left w:val="single" w:sz="4" w:space="0" w:color="auto"/>
-              <w:bottom w:val="nil"/>
-              <w:right w:val="single" w:sz="4" w:space="0" w:color="auto"/>
-            </w:tcBorders>
-            <w:vAlign w:val="center"/>
-          </w:tcPr>
-          <w:p>
-            <w:pPr>
-              <w:rPr>
-                <w:rFonts w:ascii="Times New Roman" w:hAnsi="Times New Roman" w:cs="Times New Roman"/>
-                <w:b/>
-                <w:bCs/>
-              </w:rPr>
-            </w:pPr>
-            <w:r>
-              <w:rPr>
-                <w:rFonts w:ascii="Times New Roman" w:hAnsi="Times New Roman" w:cs="Times New Roman"/>
-                <w:b/>
-                <w:bCs/>
-              </w:rPr>
-              <w:t xml:space="preserve">  </w:t>
-            </w:r>
-          </w:p>
-        </w:tc>
-        <w:tc>
-          <w:tcPr>
-            <w:tcW w:w="2104" w:type="dxa"/>
-            <w:tcBorders>
-              <w:left w:val="single" w:sz="4" w:space="0" w:color="auto"/>
-              <w:right w:val="nil"/>
-            </w:tcBorders>
-            <w:shd w:val="clear" w:color="auto" w:fill="A8D08D" w:themeFill="accent6" w:themeFillTint="99"/>
-            <w:vAlign w:val="center"/>
-          </w:tcPr>
-          <w:p>
-            <w:pPr>
-              <w:rPr>
-                <w:rFonts w:ascii="Times New Roman" w:hAnsi="Times New Roman" w:cs="Times New Roman"/>
-                <w:b/>
-                <w:bCs/>
-              </w:rPr>
-            </w:pPr>
-            <w:r>
-              <w:rPr>
-                <w:rFonts w:ascii="Times New Roman" w:hAnsi="Times New Roman" w:cs="Times New Roman"/>
-                <w:b/>
-                <w:bCs/>
-              </w:rPr>
-              <w:t>CONTACT NO.:</w:t>
-            </w:r>
-          </w:p>
-        </w:tc>
-        <w:tc>
-          <w:tcPr>
-            <w:tcW w:w="2880" w:type="dxa"/>
-            <w:tcBorders>
-              <w:top w:val="single" w:sz="4" w:space="0" w:color="auto"/>
-              <w:left w:val="nil"/>
-              <w:bottom w:val="single" w:sz="4" w:space="0" w:color="auto"/>
-              <w:right w:val="single" w:sz="4" w:space="0" w:color="auto"/>
-            </w:tcBorders>
-            <w:shd w:val="clear" w:color="auto" w:fill="FFFFFF" w:themeFill="background1"/>
-          </w:tcPr>
-          <w:p>
-            <w:pPr>
-              <w:rPr>
-                <w:rFonts w:ascii="Times New Roman" w:hAnsi="Times New Roman" w:cs="Times New Roman"/>
-                <w:b/>
-                <w:bCs/>
-              </w:rPr>
-            </w:pPr>
-          </w:p>
-        </w:tc>
-      </w:tr>
-      <w:tr>
-        <w:trPr>
-          <w:trHeight w:val="396"/>
-        </w:trPr>
-        <w:tc>
-          <w:tcPr>
-            <w:tcW w:w="2155" w:type="dxa"/>
-            <w:tcBorders>
-              <w:left w:val="single" w:sz="4" w:space="0" w:color="auto"/>
-              <w:right w:val="nil"/>
-            </w:tcBorders>
-            <w:shd w:val="clear" w:color="auto" w:fill="A8D08D" w:themeFill="accent6" w:themeFillTint="99"/>
-          </w:tcPr>
-          <w:p>
-            <w:pPr>
-              <w:rPr>
-                <w:rFonts w:ascii="Times New Roman" w:hAnsi="Times New Roman" w:cs="Times New Roman"/>
-                <w:b/>
-                <w:bCs/>
-                <w:sz w:val="20"/>
-                <w:szCs w:val="20"/>
-              </w:rPr>
-            </w:pPr>
-            <w:r>
-              <w:rPr>
-                <w:rFonts w:ascii="Times New Roman" w:hAnsi="Times New Roman" w:cs="Times New Roman"/>
-                <w:b/>
-                <w:bCs/>
-                <w:sz w:val="20"/>
-                <w:szCs w:val="20"/>
-              </w:rPr>
-              <w:t>BLOCK:</w:t>
-            </w:r>
-          </w:p>
-        </w:tc>
-        <w:tc>
-          <w:tcPr>
-            <w:tcW w:w="2802" w:type="dxa"/>
-            <w:tcBorders>
-              <w:left w:val="nil"/>
-              <w:right w:val="single" w:sz="4" w:space="0" w:color="auto"/>
-            </w:tcBorders>
-            <w:shd w:val="clear" w:color="auto" w:fill="FFFFFF" w:themeFill="background1"/>
-            <w:vAlign w:val="center"/>
-          </w:tcPr>
-          <w:p>
-            <w:pPr>
-              <w:rPr>
-                <w:rFonts w:ascii="Times New Roman" w:hAnsi="Times New Roman" w:cs="Times New Roman"/>
-                <w:b/>
-                <w:bCs/>
-              </w:rPr>
-            </w:pPr>
-          </w:p>
-        </w:tc>
-        <w:tc>
-          <w:tcPr>
-            <w:tcW w:w="236" w:type="dxa"/>
-            <w:tcBorders>
-              <w:top w:val="nil"/>
-              <w:left w:val="single" w:sz="4" w:space="0" w:color="auto"/>
-              <w:bottom w:val="nil"/>
-              <w:right w:val="single" w:sz="4" w:space="0" w:color="auto"/>
-            </w:tcBorders>
-            <w:vAlign w:val="center"/>
-          </w:tcPr>
-          <w:p>
-            <w:pPr>
-              <w:rPr>
-                <w:rFonts w:ascii="Times New Roman" w:hAnsi="Times New Roman" w:cs="Times New Roman"/>
-                <w:b/>
-                <w:bCs/>
-              </w:rPr>
-            </w:pPr>
-          </w:p>
-        </w:tc>
-        <w:tc>
-          <w:tcPr>
-            <w:tcW w:w="2104" w:type="dxa"/>
-            <w:tcBorders>
-              <w:left w:val="single" w:sz="4" w:space="0" w:color="auto"/>
-              <w:right w:val="nil"/>
-            </w:tcBorders>
-            <w:shd w:val="clear" w:color="auto" w:fill="A8D08D" w:themeFill="accent6" w:themeFillTint="99"/>
-            <w:vAlign w:val="center"/>
-          </w:tcPr>
-          <w:p>
-            <w:pPr>
-              <w:rPr>
-                <w:rFonts w:ascii="Times New Roman" w:hAnsi="Times New Roman" w:cs="Times New Roman"/>
-                <w:b/>
-                <w:bCs/>
-              </w:rPr>
-            </w:pPr>
-            <w:r>
-              <w:rPr>
-                <w:rFonts w:ascii="Times New Roman" w:hAnsi="Times New Roman" w:cs="Times New Roman"/>
-                <w:b/>
-                <w:bCs/>
-              </w:rPr>
-              <w:t>LOT TYPE:</w:t>
-            </w:r>
-          </w:p>
-        </w:tc>
-        <w:tc>
-          <w:tcPr>
-            <w:tcW w:w="2880" w:type="dxa"/>
-            <w:tcBorders>
-              <w:top w:val="single" w:sz="4" w:space="0" w:color="auto"/>
-              <w:left w:val="nil"/>
-              <w:bottom w:val="single" w:sz="4" w:space="0" w:color="auto"/>
-              <w:right w:val="single" w:sz="4" w:space="0" w:color="auto"/>
-            </w:tcBorders>
-            <w:shd w:val="clear" w:color="auto" w:fill="FFFFFF" w:themeFill="background1"/>
-          </w:tcPr>
-          <w:p>
-            <w:pPr>
-              <w:rPr>
-                <w:rFonts w:ascii="Times New Roman" w:hAnsi="Times New Roman" w:cs="Times New Roman"/>
-                <w:b/>
-                <w:bCs/>
-              </w:rPr>
-            </w:pPr>
-          </w:p>
-        </w:tc>
-      </w:tr>
-      <w:tr>
-        <w:trPr>
-          <w:trHeight w:val="396"/>
-        </w:trPr>
-        <w:tc>
-          <w:tcPr>
-            <w:tcW w:w="2155" w:type="dxa"/>
-            <w:tcBorders>
-              <w:left w:val="single" w:sz="4" w:space="0" w:color="auto"/>
-              <w:right w:val="nil"/>
-            </w:tcBorders>
-            <w:shd w:val="clear" w:color="auto" w:fill="A8D08D" w:themeFill="accent6" w:themeFillTint="99"/>
-          </w:tcPr>
-          <w:p>
-            <w:pPr>
-              <w:rPr>
-                <w:rFonts w:ascii="Times New Roman" w:hAnsi="Times New Roman" w:cs="Times New Roman"/>
-                <w:b/>
-                <w:bCs/>
-                <w:sz w:val="20"/>
-                <w:szCs w:val="20"/>
-              </w:rPr>
-            </w:pPr>
-            <w:r>
-              <w:rPr>
-                <w:rFonts w:ascii="Times New Roman" w:hAnsi="Times New Roman" w:cs="Times New Roman"/>
-                <w:b/>
-                <w:bCs/>
-                <w:sz w:val="20"/>
-                <w:szCs w:val="20"/>
-              </w:rPr>
-              <w:t>LOT NO.:</w:t>
-            </w:r>
-          </w:p>
-        </w:tc>
-        <w:tc>
-          <w:tcPr>
-            <w:tcW w:w="2802" w:type="dxa"/>
-            <w:tcBorders>
-              <w:left w:val="nil"/>
-              <w:right w:val="single" w:sz="4" w:space="0" w:color="auto"/>
-            </w:tcBorders>
-            <w:shd w:val="clear" w:color="auto" w:fill="FFFFFF" w:themeFill="background1"/>
-            <w:vAlign w:val="center"/>
-          </w:tcPr>
-          <w:p>
-            <w:pPr>
-              <w:rPr>
-                <w:rFonts w:ascii="Times New Roman" w:hAnsi="Times New Roman" w:cs="Times New Roman"/>
-                <w:b/>
-                <w:bCs/>
-              </w:rPr>
-            </w:pPr>
-          </w:p>
-        </w:tc>
-        <w:tc>
-          <w:tcPr>
-            <w:tcW w:w="236" w:type="dxa"/>
-            <w:tcBorders>
-              <w:top w:val="nil"/>
-              <w:left w:val="single" w:sz="4" w:space="0" w:color="auto"/>
-              <w:bottom w:val="nil"/>
-              <w:right w:val="single" w:sz="4" w:space="0" w:color="auto"/>
-            </w:tcBorders>
-            <w:vAlign w:val="center"/>
-          </w:tcPr>
-          <w:p>
-            <w:pPr>
-              <w:rPr>
-                <w:rFonts w:ascii="Times New Roman" w:hAnsi="Times New Roman" w:cs="Times New Roman"/>
-                <w:b/>
-                <w:bCs/>
-              </w:rPr>
-            </w:pPr>
-          </w:p>
-        </w:tc>
-        <w:tc>
-          <w:tcPr>
-            <w:tcW w:w="2104" w:type="dxa"/>
-            <w:tcBorders>
-              <w:left w:val="single" w:sz="4" w:space="0" w:color="auto"/>
-              <w:right w:val="nil"/>
-            </w:tcBorders>
-            <w:shd w:val="clear" w:color="auto" w:fill="A8D08D" w:themeFill="accent6" w:themeFillTint="99"/>
-            <w:vAlign w:val="center"/>
-          </w:tcPr>
-          <w:p>
-            <w:pPr>
-              <w:rPr>
-                <w:rFonts w:ascii="Times New Roman" w:hAnsi="Times New Roman" w:cs="Times New Roman"/>
-                <w:b/>
-                <w:bCs/>
-              </w:rPr>
-            </w:pPr>
-            <w:r>
-              <w:rPr>
-                <w:rFonts w:ascii="Times New Roman" w:hAnsi="Times New Roman" w:cs="Times New Roman"/>
-                <w:b/>
-                <w:bCs/>
-              </w:rPr>
-              <w:t>PHASE NO.:</w:t>
-            </w:r>
-          </w:p>
-        </w:tc>
-        <w:tc>
-          <w:tcPr>
-            <w:tcW w:w="2880" w:type="dxa"/>
-            <w:tcBorders>
-              <w:top w:val="single" w:sz="4" w:space="0" w:color="auto"/>
-              <w:left w:val="nil"/>
-              <w:bottom w:val="single" w:sz="4" w:space="0" w:color="auto"/>
-              <w:right w:val="single" w:sz="4" w:space="0" w:color="auto"/>
-            </w:tcBorders>
-            <w:shd w:val="clear" w:color="auto" w:fill="FFFFFF" w:themeFill="background1"/>
-          </w:tcPr>
-          <w:p>
-            <w:pPr>
-              <w:rPr>
-                <w:rFonts w:ascii="Times New Roman" w:hAnsi="Times New Roman" w:cs="Times New Roman"/>
-                <w:b/>
-                <w:bCs/>
-              </w:rPr>
-            </w:pPr>
-          </w:p>
-        </w:tc>
-      </w:tr>
-      <w:tr>
-        <w:trPr>
-          <w:trHeight w:val="396"/>
-        </w:trPr>
-        <w:tc>
-          <w:tcPr>
-            <w:tcW w:w="2155" w:type="dxa"/>
-            <w:tcBorders>
-              <w:left w:val="single" w:sz="4" w:space="0" w:color="auto"/>
-              <w:right w:val="nil"/>
-            </w:tcBorders>
-            <w:shd w:val="clear" w:color="auto" w:fill="A8D08D" w:themeFill="accent6" w:themeFillTint="99"/>
-          </w:tcPr>
-          <w:p>
-            <w:pPr>
-              <w:rPr>
-                <w:rFonts w:ascii="Times New Roman" w:hAnsi="Times New Roman" w:cs="Times New Roman"/>
-                <w:b/>
-                <w:bCs/>
-                <w:sz w:val="20"/>
-                <w:szCs w:val="20"/>
-              </w:rPr>
-            </w:pPr>
-            <w:r>
-              <w:rPr>
-                <w:rFonts w:ascii="Times New Roman" w:hAnsi="Times New Roman" w:cs="Times New Roman"/>
-                <w:b/>
-                <w:bCs/>
-                <w:sz w:val="20"/>
-                <w:szCs w:val="20"/>
-              </w:rPr>
-              <w:t>CONTRACT PRICE:</w:t>
-            </w:r>
-          </w:p>
-        </w:tc>
-        <w:tc>
-          <w:tcPr>
-            <w:tcW w:w="2802" w:type="dxa"/>
-            <w:tcBorders>
-              <w:left w:val="nil"/>
-              <w:right w:val="single" w:sz="4" w:space="0" w:color="auto"/>
-            </w:tcBorders>
-            <w:shd w:val="clear" w:color="auto" w:fill="FFFFFF" w:themeFill="background1"/>
-            <w:vAlign w:val="center"/>
-          </w:tcPr>
-          <w:p>
-            <w:pPr>
-              <w:rPr>
-                <w:rFonts w:ascii="Times New Roman" w:hAnsi="Times New Roman" w:cs="Times New Roman"/>
-                <w:b/>
-                <w:bCs/>
-              </w:rPr>
-            </w:pPr>
-          </w:p>
-        </w:tc>
-        <w:tc>
-          <w:tcPr>
-            <w:tcW w:w="236" w:type="dxa"/>
-            <w:tcBorders>
-              <w:top w:val="nil"/>
-              <w:left w:val="single" w:sz="4" w:space="0" w:color="auto"/>
-              <w:bottom w:val="nil"/>
-              <w:right w:val="single" w:sz="4" w:space="0" w:color="auto"/>
-            </w:tcBorders>
-            <w:vAlign w:val="center"/>
-          </w:tcPr>
-          <w:p>
-            <w:pPr>
-              <w:rPr>
-                <w:rFonts w:ascii="Times New Roman" w:hAnsi="Times New Roman" w:cs="Times New Roman"/>
-                <w:b/>
-                <w:bCs/>
-              </w:rPr>
-            </w:pPr>
-          </w:p>
-        </w:tc>
-        <w:tc>
-          <w:tcPr>
-            <w:tcW w:w="2104" w:type="dxa"/>
-            <w:tcBorders>
-              <w:left w:val="single" w:sz="4" w:space="0" w:color="auto"/>
-              <w:right w:val="nil"/>
-            </w:tcBorders>
-            <w:shd w:val="clear" w:color="auto" w:fill="A8D08D" w:themeFill="accent6" w:themeFillTint="99"/>
-            <w:vAlign w:val="center"/>
-          </w:tcPr>
-          <w:p>
-            <w:pPr>
-              <w:rPr>
-                <w:rFonts w:ascii="Times New Roman" w:hAnsi="Times New Roman" w:cs="Times New Roman"/>
-                <w:b/>
-                <w:bCs/>
-              </w:rPr>
-            </w:pPr>
-            <w:r>
-              <w:rPr>
-                <w:rFonts w:ascii="Times New Roman" w:hAnsi="Times New Roman" w:cs="Times New Roman"/>
-                <w:b/>
-                <w:bCs/>
-              </w:rPr>
-              <w:t>YEAR CONRACT:</w:t>
-            </w:r>
-          </w:p>
-        </w:tc>
-        <w:tc>
-          <w:tcPr>
-            <w:tcW w:w="2880" w:type="dxa"/>
-            <w:tcBorders>
-              <w:top w:val="single" w:sz="4" w:space="0" w:color="auto"/>
-              <w:left w:val="nil"/>
-              <w:bottom w:val="single" w:sz="4" w:space="0" w:color="auto"/>
-              <w:right w:val="single" w:sz="4" w:space="0" w:color="auto"/>
-            </w:tcBorders>
-            <w:shd w:val="clear" w:color="auto" w:fill="FFFFFF" w:themeFill="background1"/>
-          </w:tcPr>
-          <w:p>
-            <w:pPr>
-              <w:rPr>
-                <w:rFonts w:ascii="Times New Roman" w:hAnsi="Times New Roman" w:cs="Times New Roman"/>
-                <w:b/>
-                <w:bCs/>
-              </w:rPr>
-            </w:pPr>
-          </w:p>
-        </w:tc>
-      </w:tr>
-      <w:tr>
-        <w:trPr>
-          <w:trHeight w:val="396"/>
-        </w:trPr>
-        <w:tc>
-          <w:tcPr>
-            <w:tcW w:w="2155" w:type="dxa"/>
-            <w:tcBorders>
-              <w:left w:val="single" w:sz="4" w:space="0" w:color="auto"/>
-              <w:right w:val="nil"/>
-            </w:tcBorders>
-            <w:shd w:val="clear" w:color="auto" w:fill="A8D08D" w:themeFill="accent6" w:themeFillTint="99"/>
-          </w:tcPr>
-          <w:p>
-            <w:pPr>
-              <w:rPr>
-                <w:rFonts w:ascii="Times New Roman" w:hAnsi="Times New Roman" w:cs="Times New Roman"/>
-                <w:b/>
-                <w:bCs/>
-                <w:sz w:val="20"/>
-                <w:szCs w:val="20"/>
-              </w:rPr>
-            </w:pPr>
-            <w:r>
-              <w:rPr>
-                <w:rFonts w:ascii="Times New Roman" w:hAnsi="Times New Roman" w:cs="Times New Roman"/>
-                <w:b/>
-                <w:bCs/>
-                <w:sz w:val="20"/>
-                <w:szCs w:val="20"/>
-              </w:rPr>
-              <w:t>DATE:</w:t>
-            </w:r>
-          </w:p>
-        </w:tc>
-        <w:tc>
-          <w:tcPr>
-            <w:tcW w:w="2802" w:type="dxa"/>
-            <w:tcBorders>
-              <w:left w:val="nil"/>
-              <w:right w:val="single" w:sz="4" w:space="0" w:color="auto"/>
-            </w:tcBorders>
-            <w:shd w:val="clear" w:color="auto" w:fill="FFFFFF" w:themeFill="background1"/>
-            <w:vAlign w:val="center"/>
-          </w:tcPr>
-          <w:p>
-            <w:pPr>
-              <w:rPr>
-                <w:rFonts w:ascii="Times New Roman" w:hAnsi="Times New Roman" w:cs="Times New Roman"/>
-                <w:b/>
-                <w:bCs/>
-              </w:rPr>
-            </w:pPr>
-          </w:p>
-        </w:tc>
-        <w:tc>
-          <w:tcPr>
-            <w:tcW w:w="236" w:type="dxa"/>
-            <w:tcBorders>
-              <w:top w:val="nil"/>
-              <w:left w:val="single" w:sz="4" w:space="0" w:color="auto"/>
-              <w:bottom w:val="nil"/>
-              <w:right w:val="single" w:sz="4" w:space="0" w:color="auto"/>
-            </w:tcBorders>
-            <w:vAlign w:val="center"/>
-          </w:tcPr>
-          <w:p>
-            <w:pPr>
-              <w:rPr>
-                <w:rFonts w:ascii="Times New Roman" w:hAnsi="Times New Roman" w:cs="Times New Roman"/>
-                <w:b/>
-                <w:bCs/>
-              </w:rPr>
-            </w:pPr>
-          </w:p>
-        </w:tc>
-        <w:tc>
-          <w:tcPr>
-            <w:tcW w:w="2104" w:type="dxa"/>
-            <w:tcBorders>
-              <w:left w:val="single" w:sz="4" w:space="0" w:color="auto"/>
-              <w:right w:val="nil"/>
-            </w:tcBorders>
-            <w:shd w:val="clear" w:color="auto" w:fill="A8D08D" w:themeFill="accent6" w:themeFillTint="99"/>
-            <w:vAlign w:val="center"/>
-          </w:tcPr>
-          <w:p>
-            <w:pPr>
-              <w:rPr>
-                <w:rFonts w:ascii="Times New Roman" w:hAnsi="Times New Roman" w:cs="Times New Roman"/>
-                <w:b/>
-                <w:bCs/>
-              </w:rPr>
-            </w:pPr>
-            <w:r>
-              <w:rPr>
-                <w:rFonts w:ascii="Times New Roman" w:hAnsi="Times New Roman" w:cs="Times New Roman"/>
-                <w:b/>
-                <w:bCs/>
-              </w:rPr>
-              <w:t>AMOUNT:</w:t>
-            </w:r>
-          </w:p>
-        </w:tc>
-        <w:tc>
-          <w:tcPr>
-            <w:tcW w:w="2880" w:type="dxa"/>
-            <w:tcBorders>
-              <w:top w:val="single" w:sz="4" w:space="0" w:color="auto"/>
-              <w:left w:val="nil"/>
-              <w:bottom w:val="single" w:sz="4" w:space="0" w:color="auto"/>
-              <w:right w:val="single" w:sz="4" w:space="0" w:color="auto"/>
-            </w:tcBorders>
-            <w:shd w:val="clear" w:color="auto" w:fill="FFFFFF" w:themeFill="background1"/>
-          </w:tcPr>
-          <w:p>
-            <w:pPr>
-              <w:rPr>
-                <w:rFonts w:ascii="Times New Roman" w:hAnsi="Times New Roman" w:cs="Times New Roman"/>
-                <w:b/>
-                <w:bCs/>
-              </w:rPr>
-            </w:pPr>
-          </w:p>
-        </w:tc>
-      </w:tr>
-    </w:tbl>
-    <w:tbl>
-      <w:tblPr>
-        <w:tblStyle w:val="TableGrid"/>
-        <w:tblpPr w:leftFromText="180" w:rightFromText="180" w:vertAnchor="text" w:horzAnchor="page" w:tblpX="8310" w:tblpY="1045"/>
-        <w:tblW w:w="0" w:type="auto"/>
-        <w:shd w:val="clear" w:color="auto" w:fill="FFFFFF" w:themeFill="background1"/>
-        <w:tblLook w:val="04A0" w:firstRow="1" w:lastRow="0" w:firstColumn="1" w:lastColumn="0" w:noHBand="0" w:noVBand="1"/>
-      </w:tblPr>
-      <w:tblGrid>
-        <w:gridCol w:w="1762"/>
-        <w:gridCol w:w="1980"/>
-        <w:gridCol w:w="1440"/>
-      </w:tblGrid>
-      <w:tr>
-        <w:trPr>
-          <w:trHeight w:val="300"/>
-        </w:trPr>
-        <w:tc>
-          <w:tcPr>
-            <w:tcW w:w="1762" w:type="dxa"/>
-            <w:tcBorders>
-              <w:left w:val="single" w:sz="4" w:space="0" w:color="auto"/>
-              <w:right w:val="nil"/>
-            </w:tcBorders>
-            <w:shd w:val="clear" w:color="auto" w:fill="A8D08D" w:themeFill="accent6" w:themeFillTint="99"/>
-          </w:tcPr>
-          <w:p>
-            <w:pPr>
-              <w:rPr>
-                <w:rFonts w:ascii="Times New Roman" w:hAnsi="Times New Roman" w:cs="Times New Roman"/>
-                <w:b/>
-                <w:bCs/>
-              </w:rPr>
-            </w:pPr>
-            <w:r>
-              <w:rPr>
-                <w:rFonts w:ascii="Times New Roman" w:hAnsi="Times New Roman" w:cs="Times New Roman"/>
-                <w:b/>
-                <w:bCs/>
-              </w:rPr>
-              <w:t>AGENT:</w:t>
-            </w:r>
-          </w:p>
-        </w:tc>
-        <w:tc>
-          <w:tcPr>
-            <w:tcW w:w="3420" w:type="dxa"/>
-            <w:gridSpan w:val="2"/>
-            <w:tcBorders>
-              <w:left w:val="nil"/>
-            </w:tcBorders>
-            <w:shd w:val="clear" w:color="auto" w:fill="FFFFFF" w:themeFill="background1"/>
-          </w:tcPr>
-          <w:p>
-            <w:pPr>
-              <w:rPr>
-                <w:rFonts w:ascii="Times New Roman" w:hAnsi="Times New Roman" w:cs="Times New Roman"/>
-                <w:b/>
-                <w:bCs/>
-              </w:rPr>
-            </w:pPr>
-          </w:p>
-        </w:tc>
-      </w:tr>
-      <w:tr>
-        <w:trPr>
-          <w:trHeight w:val="136"/>
-        </w:trPr>
-        <w:tc>
-          <w:tcPr>
-            <w:tcW w:w="1762" w:type="dxa"/>
-            <w:tcBorders>
-              <w:left w:val="single" w:sz="4" w:space="0" w:color="auto"/>
-              <w:right w:val="single" w:sz="4" w:space="0" w:color="auto"/>
-            </w:tcBorders>
-            <w:shd w:val="clear" w:color="auto" w:fill="FFFFFF" w:themeFill="background1"/>
-          </w:tcPr>
-          <w:p>
-            <w:pPr>
-              <w:jc w:val="center"/>
-              <w:rPr>
-                <w:rFonts w:ascii="Times New Roman" w:hAnsi="Times New Roman" w:cs="Times New Roman"/>
-              </w:rPr>
-            </w:pPr>
-            <w:r>
-              <w:rPr>
-                <w:rFonts w:ascii="Times New Roman" w:hAnsi="Times New Roman" w:cs="Times New Roman"/>
-              </w:rPr>
-              <w:t>Date:</w:t>
-            </w:r>
-          </w:p>
-        </w:tc>
-        <w:tc>
-          <w:tcPr>
-            <w:tcW w:w="1980" w:type="dxa"/>
-            <w:tcBorders>
-              <w:left w:val="single" w:sz="4" w:space="0" w:color="auto"/>
-            </w:tcBorders>
-            <w:shd w:val="clear" w:color="auto" w:fill="FFFFFF" w:themeFill="background1"/>
-          </w:tcPr>
-          <w:p>
-            <w:pPr>
-              <w:jc w:val="center"/>
-              <w:rPr>
-                <w:rFonts w:ascii="Times New Roman" w:hAnsi="Times New Roman" w:cs="Times New Roman"/>
-              </w:rPr>
-            </w:pPr>
-            <w:r>
-              <w:rPr>
-                <w:rFonts w:ascii="Times New Roman" w:hAnsi="Times New Roman" w:cs="Times New Roman"/>
-              </w:rPr>
-              <w:t>Commission:</w:t>
-            </w:r>
-          </w:p>
-        </w:tc>
-        <w:tc>
-          <w:tcPr>
-            <w:tcW w:w="1440" w:type="dxa"/>
-            <w:shd w:val="clear" w:color="auto" w:fill="FFFFFF" w:themeFill="background1"/>
-          </w:tcPr>
-          <w:p>
-            <w:pPr>
-              <w:jc w:val="center"/>
-              <w:rPr>
-                <w:rFonts w:ascii="Times New Roman" w:hAnsi="Times New Roman" w:cs="Times New Roman"/>
-              </w:rPr>
-            </w:pPr>
-            <w:r>
-              <w:rPr>
-                <w:rFonts w:ascii="Times New Roman" w:hAnsi="Times New Roman" w:cs="Times New Roman"/>
-              </w:rPr>
-              <w:t>Signature</w:t>
-            </w:r>
-          </w:p>
-        </w:tc>
-      </w:tr>
-      <w:tr>
-        <w:trPr>
-          <w:trHeight w:val="308"/>
-        </w:trPr>
-        <w:tc>
-          <w:tcPr>
-            <w:tcW w:w="1762" w:type="dxa"/>
-            <w:tcBorders>
-              <w:left w:val="single" w:sz="4" w:space="0" w:color="auto"/>
-              <w:right w:val="single" w:sz="4" w:space="0" w:color="auto"/>
-            </w:tcBorders>
-            <w:shd w:val="clear" w:color="auto" w:fill="FFFFFF" w:themeFill="background1"/>
-          </w:tcPr>
-          <w:p>
-            <w:pPr>
-              <w:tabs>
-                <w:tab w:val="left" w:pos="69"/>
-              </w:tabs>
-              <w:ind w:left="-291" w:firstLine="33"/>
-              <w:rPr>
-                <w:rFonts w:ascii="Times New Roman" w:hAnsi="Times New Roman" w:cs="Times New Roman"/>
-              </w:rPr>
-            </w:pPr>
-          </w:p>
-        </w:tc>
-        <w:tc>
-          <w:tcPr>
-            <w:tcW w:w="1980" w:type="dxa"/>
-            <w:tcBorders>
-              <w:left w:val="single" w:sz="4" w:space="0" w:color="auto"/>
-            </w:tcBorders>
-            <w:shd w:val="clear" w:color="auto" w:fill="FFFFFF" w:themeFill="background1"/>
-          </w:tcPr>
-          <w:p>
-            <w:pPr>
-              <w:rPr>
-                <w:rFonts w:ascii="Times New Roman" w:hAnsi="Times New Roman" w:cs="Times New Roman"/>
-              </w:rPr>
-            </w:pPr>
-          </w:p>
-        </w:tc>
-        <w:tc>
-          <w:tcPr>
-            <w:tcW w:w="1440" w:type="dxa"/>
-            <w:shd w:val="clear" w:color="auto" w:fill="FFFFFF" w:themeFill="background1"/>
-          </w:tcPr>
-          <w:p>
-            <w:pPr>
-              <w:rPr>
-                <w:rFonts w:ascii="Times New Roman" w:hAnsi="Times New Roman" w:cs="Times New Roman"/>
-              </w:rPr>
-            </w:pPr>
-          </w:p>
-        </w:tc>
-      </w:tr>
-      <w:tr>
-        <w:trPr>
-          <w:trHeight w:val="43"/>
-        </w:trPr>
-        <w:tc>
-          <w:tcPr>
-            <w:tcW w:w="1762" w:type="dxa"/>
-            <w:tcBorders>
-              <w:left w:val="single" w:sz="4" w:space="0" w:color="auto"/>
-              <w:right w:val="single" w:sz="4" w:space="0" w:color="auto"/>
-            </w:tcBorders>
-            <w:shd w:val="clear" w:color="auto" w:fill="FFFFFF" w:themeFill="background1"/>
-          </w:tcPr>
-          <w:p>
-            <w:pPr>
-              <w:rPr>
-                <w:rFonts w:ascii="Times New Roman" w:hAnsi="Times New Roman" w:cs="Times New Roman"/>
-              </w:rPr>
-            </w:pPr>
-          </w:p>
-        </w:tc>
-        <w:tc>
-          <w:tcPr>
-            <w:tcW w:w="1980" w:type="dxa"/>
-            <w:tcBorders>
-              <w:left w:val="single" w:sz="4" w:space="0" w:color="auto"/>
-            </w:tcBorders>
-            <w:shd w:val="clear" w:color="auto" w:fill="FFFFFF" w:themeFill="background1"/>
-          </w:tcPr>
-          <w:p>
-            <w:pPr>
-              <w:rPr>
-                <w:rFonts w:ascii="Times New Roman" w:hAnsi="Times New Roman" w:cs="Times New Roman"/>
-              </w:rPr>
-            </w:pPr>
-          </w:p>
-        </w:tc>
-        <w:tc>
-          <w:tcPr>
-            <w:tcW w:w="1440" w:type="dxa"/>
-            <w:shd w:val="clear" w:color="auto" w:fill="FFFFFF" w:themeFill="background1"/>
-          </w:tcPr>
-          <w:p>
-            <w:pPr>
-              <w:rPr>
-                <w:rFonts w:ascii="Times New Roman" w:hAnsi="Times New Roman" w:cs="Times New Roman"/>
-              </w:rPr>
-            </w:pPr>
-          </w:p>
-        </w:tc>
-      </w:tr>
-      <w:tr>
-        <w:trPr>
-          <w:trHeight w:val="164"/>
-        </w:trPr>
-        <w:tc>
-          <w:tcPr>
-            <w:tcW w:w="1762" w:type="dxa"/>
-            <w:tcBorders>
-              <w:left w:val="single" w:sz="4" w:space="0" w:color="auto"/>
-              <w:right w:val="nil"/>
-            </w:tcBorders>
-            <w:shd w:val="clear" w:color="auto" w:fill="A8D08D" w:themeFill="accent6" w:themeFillTint="99"/>
-          </w:tcPr>
-          <w:p>
-            <w:pPr>
-              <w:rPr>
-                <w:rFonts w:ascii="Times New Roman" w:hAnsi="Times New Roman" w:cs="Times New Roman"/>
-                <w:b/>
-                <w:bCs/>
-              </w:rPr>
-            </w:pPr>
-            <w:r>
-              <w:rPr>
-                <w:rFonts w:ascii="Times New Roman" w:hAnsi="Times New Roman" w:cs="Times New Roman"/>
-                <w:b/>
-                <w:bCs/>
-              </w:rPr>
-              <w:t>BROKER:</w:t>
-            </w:r>
-          </w:p>
-        </w:tc>
-        <w:tc>
-          <w:tcPr>
-            <w:tcW w:w="3420" w:type="dxa"/>
-            <w:gridSpan w:val="2"/>
-            <w:tcBorders>
-              <w:left w:val="nil"/>
-            </w:tcBorders>
-            <w:shd w:val="clear" w:color="auto" w:fill="FFFFFF" w:themeFill="background1"/>
-          </w:tcPr>
-          <w:p>
-            <w:pPr>
-              <w:rPr>
-                <w:rFonts w:ascii="Times New Roman" w:hAnsi="Times New Roman" w:cs="Times New Roman"/>
-                <w:b/>
-                <w:bCs/>
-              </w:rPr>
-            </w:pPr>
-          </w:p>
-        </w:tc>
-      </w:tr>
-      <w:tr>
-        <w:trPr>
-          <w:trHeight w:val="43"/>
-        </w:trPr>
-        <w:tc>
-          <w:tcPr>
-            <w:tcW w:w="1762" w:type="dxa"/>
-            <w:tcBorders>
-              <w:left w:val="single" w:sz="4" w:space="0" w:color="auto"/>
-              <w:right w:val="single" w:sz="4" w:space="0" w:color="auto"/>
-            </w:tcBorders>
-            <w:shd w:val="clear" w:color="auto" w:fill="FFFFFF" w:themeFill="background1"/>
-          </w:tcPr>
-          <w:p>
-            <w:pPr>
-              <w:rPr>
-                <w:rFonts w:ascii="Times New Roman" w:hAnsi="Times New Roman" w:cs="Times New Roman"/>
-              </w:rPr>
-            </w:pPr>
-          </w:p>
-        </w:tc>
-        <w:tc>
-          <w:tcPr>
-            <w:tcW w:w="1980" w:type="dxa"/>
-            <w:tcBorders>
-              <w:left w:val="single" w:sz="4" w:space="0" w:color="auto"/>
-            </w:tcBorders>
-            <w:shd w:val="clear" w:color="auto" w:fill="FFFFFF" w:themeFill="background1"/>
-          </w:tcPr>
-          <w:p>
-            <w:pPr>
-              <w:rPr>
-                <w:rFonts w:ascii="Times New Roman" w:hAnsi="Times New Roman" w:cs="Times New Roman"/>
-              </w:rPr>
-            </w:pPr>
-          </w:p>
-        </w:tc>
-        <w:tc>
-          <w:tcPr>
-            <w:tcW w:w="1440" w:type="dxa"/>
-            <w:shd w:val="clear" w:color="auto" w:fill="FFFFFF" w:themeFill="background1"/>
-          </w:tcPr>
-          <w:p>
-            <w:pPr>
-              <w:rPr>
-                <w:rFonts w:ascii="Times New Roman" w:hAnsi="Times New Roman" w:cs="Times New Roman"/>
-              </w:rPr>
-            </w:pPr>
-          </w:p>
-        </w:tc>
-      </w:tr>
-      <w:tr>
-        <w:trPr>
-          <w:trHeight w:val="297"/>
-        </w:trPr>
-        <w:tc>
-          <w:tcPr>
-            <w:tcW w:w="1762" w:type="dxa"/>
-            <w:tcBorders>
-              <w:left w:val="single" w:sz="4" w:space="0" w:color="auto"/>
-              <w:right w:val="single" w:sz="4" w:space="0" w:color="auto"/>
-            </w:tcBorders>
-            <w:shd w:val="clear" w:color="auto" w:fill="FFFFFF" w:themeFill="background1"/>
-          </w:tcPr>
-          <w:p>
-            <w:pPr>
-              <w:rPr>
-                <w:rFonts w:ascii="Times New Roman" w:hAnsi="Times New Roman" w:cs="Times New Roman"/>
-              </w:rPr>
-            </w:pPr>
-          </w:p>
-        </w:tc>
-        <w:tc>
-          <w:tcPr>
-            <w:tcW w:w="1980" w:type="dxa"/>
-            <w:tcBorders>
-              <w:left w:val="single" w:sz="4" w:space="0" w:color="auto"/>
-            </w:tcBorders>
-            <w:shd w:val="clear" w:color="auto" w:fill="FFFFFF" w:themeFill="background1"/>
-          </w:tcPr>
-          <w:p>
-            <w:pPr>
-              <w:rPr>
-                <w:rFonts w:ascii="Times New Roman" w:hAnsi="Times New Roman" w:cs="Times New Roman"/>
-              </w:rPr>
-            </w:pPr>
-          </w:p>
-        </w:tc>
-        <w:tc>
-          <w:tcPr>
-            <w:tcW w:w="1440" w:type="dxa"/>
-            <w:shd w:val="clear" w:color="auto" w:fill="FFFFFF" w:themeFill="background1"/>
-          </w:tcPr>
-          <w:p>
-            <w:pPr>
-              <w:rPr>
-                <w:rFonts w:ascii="Times New Roman" w:hAnsi="Times New Roman" w:cs="Times New Roman"/>
-              </w:rPr>
-            </w:pPr>
-          </w:p>
-        </w:tc>
-      </w:tr>
-    </w:tbl>
     <w:p>
       <w:pPr>
+        <w:spacing w:before="0" w:after="0" w:line="20" w:lineRule="exact"/>
         <w:rPr>
           <w:rFonts w:ascii="Times New Roman" w:hAnsi="Times New Roman" w:cs="Times New Roman"/>
+          <w:sz w:val="2"/>
         </w:rPr>
       </w:pPr>
-      <w:r>
-        <w:rPr>
-          <w:rFonts w:ascii="Times New Roman" w:hAnsi="Times New Roman" w:cs="Times New Roman"/>
-        </w:rPr>
-        <w:br w:type="page"/>
-      </w:r>
     </w:p>
     <w:sectPr>
       <w:pgSz w:w="16838" w:h="11906" w:orient="landscape" w:code="9"/>

</xml_diff>

<commit_message>
Envelope sheet: no floating tables, so every Word viewer shows one clean page
Co-Authored-By: Claude Sonnet 5.5 <noreply@anthropic.com>
Claude-Session: https://claude.ai/code/session_01FvsgfPSSL5saKLwduZ7dQu
</commit_message>
<xml_diff>
--- a/customer-monitoring-sheet.docx
+++ b/customer-monitoring-sheet.docx
@@ -76,1065 +76,1137 @@
         </w:drawing>
       </w:r>
     </w:p>
+    <w:p>
+      <w:pPr>
+        <w:spacing w:before="0" w:after="0" w:line="1040" w:lineRule="exact"/>
+        <w:rPr>
+          <w:sz w:val="2"/>
+        </w:rPr>
+      </w:pPr>
+    </w:p>
+    <w:tbl>
+      <w:tblPr>
+        <w:tblW w:w="15729" w:type="dxa"/>
+        <w:tblInd w:w="-289" w:type="dxa"/>
+        <w:tblLayout w:type="fixed"/>
+        <w:tblCellMar>
+          <w:top w:w="0" w:type="dxa"/>
+          <w:left w:w="0" w:type="dxa"/>
+          <w:bottom w:w="0" w:type="dxa"/>
+          <w:right w:w="0" w:type="dxa"/>
+        </w:tblCellMar>
+      </w:tblPr>
+      <w:tblGrid>
+        <w:gridCol w:w="10177"/>
+        <w:gridCol w:w="370"/>
+        <w:gridCol w:w="5182"/>
+      </w:tblGrid>
+      <w:tr>
+        <w:tc>
+          <w:tcPr>
+            <w:tcW w:w="10177" w:type="dxa"/>
+          </w:tcPr>
+          <w:tbl>
+            <w:tblPr>
+              <w:tblStyle w:val="TableGrid"/>
+              <w:tblW w:w="10177" w:type="dxa"/>
+              <w:shd w:val="clear" w:color="auto" w:fill="FFFFFF" w:themeFill="background1"/>
+              <w:tblLook w:val="04A0" w:firstRow="1" w:lastRow="0" w:firstColumn="1" w:lastColumn="0" w:noHBand="0" w:noVBand="1"/>
+            </w:tblPr>
+            <w:tblGrid>
+              <w:gridCol w:w="2155"/>
+              <w:gridCol w:w="2802"/>
+              <w:gridCol w:w="236"/>
+              <w:gridCol w:w="2104"/>
+              <w:gridCol w:w="2880"/>
+            </w:tblGrid>
+            <w:tr>
+              <w:trPr>
+                <w:trHeight w:val="396"/>
+              </w:trPr>
+              <w:tc>
+                <w:tcPr>
+                  <w:tcW w:w="2155" w:type="dxa"/>
+                  <w:tcBorders>
+                    <w:left w:val="single" w:sz="4" w:space="0" w:color="auto"/>
+                    <w:right w:val="nil"/>
+                  </w:tcBorders>
+                  <w:shd w:val="clear" w:color="auto" w:fill="A8D08D" w:themeFill="accent6" w:themeFillTint="99"/>
+                  <w:vAlign w:val="center"/>
+                </w:tcPr>
+                <w:p>
+                  <w:pPr>
+                    <w:rPr>
+                      <w:rFonts w:ascii="Times New Roman" w:hAnsi="Times New Roman" w:cs="Times New Roman"/>
+                      <w:b/>
+                      <w:bCs/>
+                      <w:sz w:val="20"/>
+                      <w:szCs w:val="20"/>
+                    </w:rPr>
+                  </w:pPr>
+                  <w:r>
+                    <w:rPr>
+                      <w:rFonts w:ascii="Times New Roman" w:hAnsi="Times New Roman" w:cs="Times New Roman"/>
+                      <w:b/>
+                      <w:bCs/>
+                      <w:sz w:val="20"/>
+                      <w:szCs w:val="20"/>
+                    </w:rPr>
+                    <w:t>NAME:</w:t>
+                  </w:r>
+                </w:p>
+              </w:tc>
+              <w:tc>
+                <w:tcPr>
+                  <w:tcW w:w="2802" w:type="dxa"/>
+                  <w:tcBorders>
+                    <w:left w:val="nil"/>
+                    <w:right w:val="single" w:sz="4" w:space="0" w:color="auto"/>
+                  </w:tcBorders>
+                  <w:shd w:val="clear" w:color="auto" w:fill="FFFFFF" w:themeFill="background1"/>
+                  <w:vAlign w:val="center"/>
+                </w:tcPr>
+                <w:p>
+                  <w:pPr>
+                    <w:rPr>
+                      <w:rFonts w:ascii="Times New Roman" w:hAnsi="Times New Roman" w:cs="Times New Roman"/>
+                      <w:b/>
+                      <w:bCs/>
+                    </w:rPr>
+                  </w:pPr>
+                </w:p>
+              </w:tc>
+              <w:tc>
+                <w:tcPr>
+                  <w:tcW w:w="236" w:type="dxa"/>
+                  <w:tcBorders>
+                    <w:top w:val="nil"/>
+                    <w:left w:val="single" w:sz="4" w:space="0" w:color="auto"/>
+                    <w:bottom w:val="nil"/>
+                    <w:right w:val="single" w:sz="4" w:space="0" w:color="auto"/>
+                  </w:tcBorders>
+                  <w:vAlign w:val="center"/>
+                </w:tcPr>
+                <w:p>
+                  <w:pPr>
+                    <w:rPr>
+                      <w:rFonts w:ascii="Times New Roman" w:hAnsi="Times New Roman" w:cs="Times New Roman"/>
+                      <w:b/>
+                      <w:bCs/>
+                    </w:rPr>
+                  </w:pPr>
+                  <w:r>
+                    <w:rPr>
+                      <w:rFonts w:ascii="Times New Roman" w:hAnsi="Times New Roman" w:cs="Times New Roman"/>
+                      <w:b/>
+                      <w:bCs/>
+                    </w:rPr>
+                    <w:t xml:space="preserve">  </w:t>
+                  </w:r>
+                </w:p>
+              </w:tc>
+              <w:tc>
+                <w:tcPr>
+                  <w:tcW w:w="2104" w:type="dxa"/>
+                  <w:tcBorders>
+                    <w:left w:val="single" w:sz="4" w:space="0" w:color="auto"/>
+                    <w:right w:val="nil"/>
+                  </w:tcBorders>
+                  <w:shd w:val="clear" w:color="auto" w:fill="A8D08D" w:themeFill="accent6" w:themeFillTint="99"/>
+                  <w:vAlign w:val="center"/>
+                </w:tcPr>
+                <w:p>
+                  <w:pPr>
+                    <w:rPr>
+                      <w:rFonts w:ascii="Times New Roman" w:hAnsi="Times New Roman" w:cs="Times New Roman"/>
+                      <w:b/>
+                      <w:bCs/>
+                    </w:rPr>
+                  </w:pPr>
+                  <w:r>
+                    <w:rPr>
+                      <w:rFonts w:ascii="Times New Roman" w:hAnsi="Times New Roman" w:cs="Times New Roman"/>
+                      <w:b/>
+                      <w:bCs/>
+                    </w:rPr>
+                    <w:t>CONTACT NO.:</w:t>
+                  </w:r>
+                </w:p>
+              </w:tc>
+              <w:tc>
+                <w:tcPr>
+                  <w:tcW w:w="2880" w:type="dxa"/>
+                  <w:tcBorders>
+                    <w:top w:val="single" w:sz="4" w:space="0" w:color="auto"/>
+                    <w:left w:val="nil"/>
+                    <w:bottom w:val="single" w:sz="4" w:space="0" w:color="auto"/>
+                    <w:right w:val="single" w:sz="4" w:space="0" w:color="auto"/>
+                  </w:tcBorders>
+                  <w:shd w:val="clear" w:color="auto" w:fill="FFFFFF" w:themeFill="background1"/>
+                </w:tcPr>
+                <w:p>
+                  <w:pPr>
+                    <w:rPr>
+                      <w:rFonts w:ascii="Times New Roman" w:hAnsi="Times New Roman" w:cs="Times New Roman"/>
+                      <w:b/>
+                      <w:bCs/>
+                    </w:rPr>
+                  </w:pPr>
+                </w:p>
+              </w:tc>
+            </w:tr>
+            <w:tr>
+              <w:trPr>
+                <w:trHeight w:val="396"/>
+              </w:trPr>
+              <w:tc>
+                <w:tcPr>
+                  <w:tcW w:w="2155" w:type="dxa"/>
+                  <w:tcBorders>
+                    <w:left w:val="single" w:sz="4" w:space="0" w:color="auto"/>
+                    <w:right w:val="nil"/>
+                  </w:tcBorders>
+                  <w:shd w:val="clear" w:color="auto" w:fill="A8D08D" w:themeFill="accent6" w:themeFillTint="99"/>
+                </w:tcPr>
+                <w:p>
+                  <w:pPr>
+                    <w:rPr>
+                      <w:rFonts w:ascii="Times New Roman" w:hAnsi="Times New Roman" w:cs="Times New Roman"/>
+                      <w:b/>
+                      <w:bCs/>
+                      <w:sz w:val="20"/>
+                      <w:szCs w:val="20"/>
+                    </w:rPr>
+                  </w:pPr>
+                  <w:r>
+                    <w:rPr>
+                      <w:rFonts w:ascii="Times New Roman" w:hAnsi="Times New Roman" w:cs="Times New Roman"/>
+                      <w:b/>
+                      <w:bCs/>
+                      <w:sz w:val="20"/>
+                      <w:szCs w:val="20"/>
+                    </w:rPr>
+                    <w:t>BLOCK:</w:t>
+                  </w:r>
+                </w:p>
+              </w:tc>
+              <w:tc>
+                <w:tcPr>
+                  <w:tcW w:w="2802" w:type="dxa"/>
+                  <w:tcBorders>
+                    <w:left w:val="nil"/>
+                    <w:right w:val="single" w:sz="4" w:space="0" w:color="auto"/>
+                  </w:tcBorders>
+                  <w:shd w:val="clear" w:color="auto" w:fill="FFFFFF" w:themeFill="background1"/>
+                  <w:vAlign w:val="center"/>
+                </w:tcPr>
+                <w:p>
+                  <w:pPr>
+                    <w:rPr>
+                      <w:rFonts w:ascii="Times New Roman" w:hAnsi="Times New Roman" w:cs="Times New Roman"/>
+                      <w:b/>
+                      <w:bCs/>
+                    </w:rPr>
+                  </w:pPr>
+                </w:p>
+              </w:tc>
+              <w:tc>
+                <w:tcPr>
+                  <w:tcW w:w="236" w:type="dxa"/>
+                  <w:tcBorders>
+                    <w:top w:val="nil"/>
+                    <w:left w:val="single" w:sz="4" w:space="0" w:color="auto"/>
+                    <w:bottom w:val="nil"/>
+                    <w:right w:val="single" w:sz="4" w:space="0" w:color="auto"/>
+                  </w:tcBorders>
+                  <w:vAlign w:val="center"/>
+                </w:tcPr>
+                <w:p>
+                  <w:pPr>
+                    <w:rPr>
+                      <w:rFonts w:ascii="Times New Roman" w:hAnsi="Times New Roman" w:cs="Times New Roman"/>
+                      <w:b/>
+                      <w:bCs/>
+                    </w:rPr>
+                  </w:pPr>
+                </w:p>
+              </w:tc>
+              <w:tc>
+                <w:tcPr>
+                  <w:tcW w:w="2104" w:type="dxa"/>
+                  <w:tcBorders>
+                    <w:left w:val="single" w:sz="4" w:space="0" w:color="auto"/>
+                    <w:right w:val="nil"/>
+                  </w:tcBorders>
+                  <w:shd w:val="clear" w:color="auto" w:fill="A8D08D" w:themeFill="accent6" w:themeFillTint="99"/>
+                  <w:vAlign w:val="center"/>
+                </w:tcPr>
+                <w:p>
+                  <w:pPr>
+                    <w:rPr>
+                      <w:rFonts w:ascii="Times New Roman" w:hAnsi="Times New Roman" w:cs="Times New Roman"/>
+                      <w:b/>
+                      <w:bCs/>
+                    </w:rPr>
+                  </w:pPr>
+                  <w:r>
+                    <w:rPr>
+                      <w:rFonts w:ascii="Times New Roman" w:hAnsi="Times New Roman" w:cs="Times New Roman"/>
+                      <w:b/>
+                      <w:bCs/>
+                    </w:rPr>
+                    <w:t>LOT TYPE:</w:t>
+                  </w:r>
+                </w:p>
+              </w:tc>
+              <w:tc>
+                <w:tcPr>
+                  <w:tcW w:w="2880" w:type="dxa"/>
+                  <w:tcBorders>
+                    <w:top w:val="single" w:sz="4" w:space="0" w:color="auto"/>
+                    <w:left w:val="nil"/>
+                    <w:bottom w:val="single" w:sz="4" w:space="0" w:color="auto"/>
+                    <w:right w:val="single" w:sz="4" w:space="0" w:color="auto"/>
+                  </w:tcBorders>
+                  <w:shd w:val="clear" w:color="auto" w:fill="FFFFFF" w:themeFill="background1"/>
+                </w:tcPr>
+                <w:p>
+                  <w:pPr>
+                    <w:rPr>
+                      <w:rFonts w:ascii="Times New Roman" w:hAnsi="Times New Roman" w:cs="Times New Roman"/>
+                      <w:b/>
+                      <w:bCs/>
+                    </w:rPr>
+                  </w:pPr>
+                </w:p>
+              </w:tc>
+            </w:tr>
+            <w:tr>
+              <w:trPr>
+                <w:trHeight w:val="396"/>
+              </w:trPr>
+              <w:tc>
+                <w:tcPr>
+                  <w:tcW w:w="2155" w:type="dxa"/>
+                  <w:tcBorders>
+                    <w:left w:val="single" w:sz="4" w:space="0" w:color="auto"/>
+                    <w:right w:val="nil"/>
+                  </w:tcBorders>
+                  <w:shd w:val="clear" w:color="auto" w:fill="A8D08D" w:themeFill="accent6" w:themeFillTint="99"/>
+                </w:tcPr>
+                <w:p>
+                  <w:pPr>
+                    <w:rPr>
+                      <w:rFonts w:ascii="Times New Roman" w:hAnsi="Times New Roman" w:cs="Times New Roman"/>
+                      <w:b/>
+                      <w:bCs/>
+                      <w:sz w:val="20"/>
+                      <w:szCs w:val="20"/>
+                    </w:rPr>
+                  </w:pPr>
+                  <w:r>
+                    <w:rPr>
+                      <w:rFonts w:ascii="Times New Roman" w:hAnsi="Times New Roman" w:cs="Times New Roman"/>
+                      <w:b/>
+                      <w:bCs/>
+                      <w:sz w:val="20"/>
+                      <w:szCs w:val="20"/>
+                    </w:rPr>
+                    <w:t>LOT NO.:</w:t>
+                  </w:r>
+                </w:p>
+              </w:tc>
+              <w:tc>
+                <w:tcPr>
+                  <w:tcW w:w="2802" w:type="dxa"/>
+                  <w:tcBorders>
+                    <w:left w:val="nil"/>
+                    <w:right w:val="single" w:sz="4" w:space="0" w:color="auto"/>
+                  </w:tcBorders>
+                  <w:shd w:val="clear" w:color="auto" w:fill="FFFFFF" w:themeFill="background1"/>
+                  <w:vAlign w:val="center"/>
+                </w:tcPr>
+                <w:p>
+                  <w:pPr>
+                    <w:rPr>
+                      <w:rFonts w:ascii="Times New Roman" w:hAnsi="Times New Roman" w:cs="Times New Roman"/>
+                      <w:b/>
+                      <w:bCs/>
+                    </w:rPr>
+                  </w:pPr>
+                </w:p>
+              </w:tc>
+              <w:tc>
+                <w:tcPr>
+                  <w:tcW w:w="236" w:type="dxa"/>
+                  <w:tcBorders>
+                    <w:top w:val="nil"/>
+                    <w:left w:val="single" w:sz="4" w:space="0" w:color="auto"/>
+                    <w:bottom w:val="nil"/>
+                    <w:right w:val="single" w:sz="4" w:space="0" w:color="auto"/>
+                  </w:tcBorders>
+                  <w:vAlign w:val="center"/>
+                </w:tcPr>
+                <w:p>
+                  <w:pPr>
+                    <w:rPr>
+                      <w:rFonts w:ascii="Times New Roman" w:hAnsi="Times New Roman" w:cs="Times New Roman"/>
+                      <w:b/>
+                      <w:bCs/>
+                    </w:rPr>
+                  </w:pPr>
+                </w:p>
+              </w:tc>
+              <w:tc>
+                <w:tcPr>
+                  <w:tcW w:w="2104" w:type="dxa"/>
+                  <w:tcBorders>
+                    <w:left w:val="single" w:sz="4" w:space="0" w:color="auto"/>
+                    <w:right w:val="nil"/>
+                  </w:tcBorders>
+                  <w:shd w:val="clear" w:color="auto" w:fill="A8D08D" w:themeFill="accent6" w:themeFillTint="99"/>
+                  <w:vAlign w:val="center"/>
+                </w:tcPr>
+                <w:p>
+                  <w:pPr>
+                    <w:rPr>
+                      <w:rFonts w:ascii="Times New Roman" w:hAnsi="Times New Roman" w:cs="Times New Roman"/>
+                      <w:b/>
+                      <w:bCs/>
+                    </w:rPr>
+                  </w:pPr>
+                  <w:r>
+                    <w:rPr>
+                      <w:rFonts w:ascii="Times New Roman" w:hAnsi="Times New Roman" w:cs="Times New Roman"/>
+                      <w:b/>
+                      <w:bCs/>
+                    </w:rPr>
+                    <w:t>PHASE NO.:</w:t>
+                  </w:r>
+                </w:p>
+              </w:tc>
+              <w:tc>
+                <w:tcPr>
+                  <w:tcW w:w="2880" w:type="dxa"/>
+                  <w:tcBorders>
+                    <w:top w:val="single" w:sz="4" w:space="0" w:color="auto"/>
+                    <w:left w:val="nil"/>
+                    <w:bottom w:val="single" w:sz="4" w:space="0" w:color="auto"/>
+                    <w:right w:val="single" w:sz="4" w:space="0" w:color="auto"/>
+                  </w:tcBorders>
+                  <w:shd w:val="clear" w:color="auto" w:fill="FFFFFF" w:themeFill="background1"/>
+                </w:tcPr>
+                <w:p>
+                  <w:pPr>
+                    <w:rPr>
+                      <w:rFonts w:ascii="Times New Roman" w:hAnsi="Times New Roman" w:cs="Times New Roman"/>
+                      <w:b/>
+                      <w:bCs/>
+                    </w:rPr>
+                  </w:pPr>
+                </w:p>
+              </w:tc>
+            </w:tr>
+            <w:tr>
+              <w:trPr>
+                <w:trHeight w:val="396"/>
+              </w:trPr>
+              <w:tc>
+                <w:tcPr>
+                  <w:tcW w:w="2155" w:type="dxa"/>
+                  <w:tcBorders>
+                    <w:left w:val="single" w:sz="4" w:space="0" w:color="auto"/>
+                    <w:right w:val="nil"/>
+                  </w:tcBorders>
+                  <w:shd w:val="clear" w:color="auto" w:fill="A8D08D" w:themeFill="accent6" w:themeFillTint="99"/>
+                </w:tcPr>
+                <w:p>
+                  <w:pPr>
+                    <w:rPr>
+                      <w:rFonts w:ascii="Times New Roman" w:hAnsi="Times New Roman" w:cs="Times New Roman"/>
+                      <w:b/>
+                      <w:bCs/>
+                      <w:sz w:val="20"/>
+                      <w:szCs w:val="20"/>
+                    </w:rPr>
+                  </w:pPr>
+                  <w:r>
+                    <w:rPr>
+                      <w:rFonts w:ascii="Times New Roman" w:hAnsi="Times New Roman" w:cs="Times New Roman"/>
+                      <w:b/>
+                      <w:bCs/>
+                      <w:sz w:val="20"/>
+                      <w:szCs w:val="20"/>
+                    </w:rPr>
+                    <w:t>CONTRACT PRICE:</w:t>
+                  </w:r>
+                </w:p>
+              </w:tc>
+              <w:tc>
+                <w:tcPr>
+                  <w:tcW w:w="2802" w:type="dxa"/>
+                  <w:tcBorders>
+                    <w:left w:val="nil"/>
+                    <w:right w:val="single" w:sz="4" w:space="0" w:color="auto"/>
+                  </w:tcBorders>
+                  <w:shd w:val="clear" w:color="auto" w:fill="FFFFFF" w:themeFill="background1"/>
+                  <w:vAlign w:val="center"/>
+                </w:tcPr>
+                <w:p>
+                  <w:pPr>
+                    <w:rPr>
+                      <w:rFonts w:ascii="Times New Roman" w:hAnsi="Times New Roman" w:cs="Times New Roman"/>
+                      <w:b/>
+                      <w:bCs/>
+                    </w:rPr>
+                  </w:pPr>
+                </w:p>
+              </w:tc>
+              <w:tc>
+                <w:tcPr>
+                  <w:tcW w:w="236" w:type="dxa"/>
+                  <w:tcBorders>
+                    <w:top w:val="nil"/>
+                    <w:left w:val="single" w:sz="4" w:space="0" w:color="auto"/>
+                    <w:bottom w:val="nil"/>
+                    <w:right w:val="single" w:sz="4" w:space="0" w:color="auto"/>
+                  </w:tcBorders>
+                  <w:vAlign w:val="center"/>
+                </w:tcPr>
+                <w:p>
+                  <w:pPr>
+                    <w:rPr>
+                      <w:rFonts w:ascii="Times New Roman" w:hAnsi="Times New Roman" w:cs="Times New Roman"/>
+                      <w:b/>
+                      <w:bCs/>
+                    </w:rPr>
+                  </w:pPr>
+                </w:p>
+              </w:tc>
+              <w:tc>
+                <w:tcPr>
+                  <w:tcW w:w="2104" w:type="dxa"/>
+                  <w:tcBorders>
+                    <w:left w:val="single" w:sz="4" w:space="0" w:color="auto"/>
+                    <w:right w:val="nil"/>
+                  </w:tcBorders>
+                  <w:shd w:val="clear" w:color="auto" w:fill="A8D08D" w:themeFill="accent6" w:themeFillTint="99"/>
+                  <w:vAlign w:val="center"/>
+                </w:tcPr>
+                <w:p>
+                  <w:pPr>
+                    <w:rPr>
+                      <w:rFonts w:ascii="Times New Roman" w:hAnsi="Times New Roman" w:cs="Times New Roman"/>
+                      <w:b/>
+                      <w:bCs/>
+                    </w:rPr>
+                  </w:pPr>
+                  <w:r>
+                    <w:rPr>
+                      <w:rFonts w:ascii="Times New Roman" w:hAnsi="Times New Roman" w:cs="Times New Roman"/>
+                      <w:b/>
+                      <w:bCs/>
+                    </w:rPr>
+                    <w:t>YEAR CONRACT:</w:t>
+                  </w:r>
+                </w:p>
+              </w:tc>
+              <w:tc>
+                <w:tcPr>
+                  <w:tcW w:w="2880" w:type="dxa"/>
+                  <w:tcBorders>
+                    <w:top w:val="single" w:sz="4" w:space="0" w:color="auto"/>
+                    <w:left w:val="nil"/>
+                    <w:bottom w:val="single" w:sz="4" w:space="0" w:color="auto"/>
+                    <w:right w:val="single" w:sz="4" w:space="0" w:color="auto"/>
+                  </w:tcBorders>
+                  <w:shd w:val="clear" w:color="auto" w:fill="FFFFFF" w:themeFill="background1"/>
+                </w:tcPr>
+                <w:p>
+                  <w:pPr>
+                    <w:rPr>
+                      <w:rFonts w:ascii="Times New Roman" w:hAnsi="Times New Roman" w:cs="Times New Roman"/>
+                      <w:b/>
+                      <w:bCs/>
+                    </w:rPr>
+                  </w:pPr>
+                </w:p>
+              </w:tc>
+            </w:tr>
+            <w:tr>
+              <w:trPr>
+                <w:trHeight w:val="396"/>
+              </w:trPr>
+              <w:tc>
+                <w:tcPr>
+                  <w:tcW w:w="2155" w:type="dxa"/>
+                  <w:tcBorders>
+                    <w:left w:val="single" w:sz="4" w:space="0" w:color="auto"/>
+                    <w:right w:val="nil"/>
+                  </w:tcBorders>
+                  <w:shd w:val="clear" w:color="auto" w:fill="A8D08D" w:themeFill="accent6" w:themeFillTint="99"/>
+                </w:tcPr>
+                <w:p>
+                  <w:pPr>
+                    <w:rPr>
+                      <w:rFonts w:ascii="Times New Roman" w:hAnsi="Times New Roman" w:cs="Times New Roman"/>
+                      <w:b/>
+                      <w:bCs/>
+                      <w:sz w:val="20"/>
+                      <w:szCs w:val="20"/>
+                    </w:rPr>
+                  </w:pPr>
+                  <w:r>
+                    <w:rPr>
+                      <w:rFonts w:ascii="Times New Roman" w:hAnsi="Times New Roman" w:cs="Times New Roman"/>
+                      <w:b/>
+                      <w:bCs/>
+                      <w:sz w:val="20"/>
+                      <w:szCs w:val="20"/>
+                    </w:rPr>
+                    <w:t>DATE:</w:t>
+                  </w:r>
+                </w:p>
+              </w:tc>
+              <w:tc>
+                <w:tcPr>
+                  <w:tcW w:w="2802" w:type="dxa"/>
+                  <w:tcBorders>
+                    <w:left w:val="nil"/>
+                    <w:right w:val="single" w:sz="4" w:space="0" w:color="auto"/>
+                  </w:tcBorders>
+                  <w:shd w:val="clear" w:color="auto" w:fill="FFFFFF" w:themeFill="background1"/>
+                  <w:vAlign w:val="center"/>
+                </w:tcPr>
+                <w:p>
+                  <w:pPr>
+                    <w:rPr>
+                      <w:rFonts w:ascii="Times New Roman" w:hAnsi="Times New Roman" w:cs="Times New Roman"/>
+                      <w:b/>
+                      <w:bCs/>
+                    </w:rPr>
+                  </w:pPr>
+                </w:p>
+              </w:tc>
+              <w:tc>
+                <w:tcPr>
+                  <w:tcW w:w="236" w:type="dxa"/>
+                  <w:tcBorders>
+                    <w:top w:val="nil"/>
+                    <w:left w:val="single" w:sz="4" w:space="0" w:color="auto"/>
+                    <w:bottom w:val="nil"/>
+                    <w:right w:val="single" w:sz="4" w:space="0" w:color="auto"/>
+                  </w:tcBorders>
+                  <w:vAlign w:val="center"/>
+                </w:tcPr>
+                <w:p>
+                  <w:pPr>
+                    <w:rPr>
+                      <w:rFonts w:ascii="Times New Roman" w:hAnsi="Times New Roman" w:cs="Times New Roman"/>
+                      <w:b/>
+                      <w:bCs/>
+                    </w:rPr>
+                  </w:pPr>
+                </w:p>
+              </w:tc>
+              <w:tc>
+                <w:tcPr>
+                  <w:tcW w:w="2104" w:type="dxa"/>
+                  <w:tcBorders>
+                    <w:left w:val="single" w:sz="4" w:space="0" w:color="auto"/>
+                    <w:right w:val="nil"/>
+                  </w:tcBorders>
+                  <w:shd w:val="clear" w:color="auto" w:fill="A8D08D" w:themeFill="accent6" w:themeFillTint="99"/>
+                  <w:vAlign w:val="center"/>
+                </w:tcPr>
+                <w:p>
+                  <w:pPr>
+                    <w:rPr>
+                      <w:rFonts w:ascii="Times New Roman" w:hAnsi="Times New Roman" w:cs="Times New Roman"/>
+                      <w:b/>
+                      <w:bCs/>
+                    </w:rPr>
+                  </w:pPr>
+                  <w:r>
+                    <w:rPr>
+                      <w:rFonts w:ascii="Times New Roman" w:hAnsi="Times New Roman" w:cs="Times New Roman"/>
+                      <w:b/>
+                      <w:bCs/>
+                    </w:rPr>
+                    <w:t>AMOUNT:</w:t>
+                  </w:r>
+                </w:p>
+              </w:tc>
+              <w:tc>
+                <w:tcPr>
+                  <w:tcW w:w="2880" w:type="dxa"/>
+                  <w:tcBorders>
+                    <w:top w:val="single" w:sz="4" w:space="0" w:color="auto"/>
+                    <w:left w:val="nil"/>
+                    <w:bottom w:val="single" w:sz="4" w:space="0" w:color="auto"/>
+                    <w:right w:val="single" w:sz="4" w:space="0" w:color="auto"/>
+                  </w:tcBorders>
+                  <w:shd w:val="clear" w:color="auto" w:fill="FFFFFF" w:themeFill="background1"/>
+                </w:tcPr>
+                <w:p>
+                  <w:pPr>
+                    <w:rPr>
+                      <w:rFonts w:ascii="Times New Roman" w:hAnsi="Times New Roman" w:cs="Times New Roman"/>
+                      <w:b/>
+                      <w:bCs/>
+                    </w:rPr>
+                  </w:pPr>
+                </w:p>
+              </w:tc>
+            </w:tr>
+          </w:tbl>
+          <w:p>
+            <w:pPr>
+              <w:spacing w:before="0" w:after="0" w:line="20" w:lineRule="exact"/>
+              <w:rPr>
+                <w:sz w:val="2"/>
+              </w:rPr>
+            </w:pPr>
+          </w:p>
+        </w:tc>
+        <w:tc>
+          <w:tcPr>
+            <w:tcW w:w="370" w:type="dxa"/>
+          </w:tcPr>
+          <w:p>
+            <w:pPr>
+              <w:spacing w:before="0" w:after="0" w:line="20" w:lineRule="exact"/>
+              <w:rPr>
+                <w:sz w:val="2"/>
+              </w:rPr>
+            </w:pPr>
+          </w:p>
+        </w:tc>
+        <w:tc>
+          <w:tcPr>
+            <w:tcW w:w="5182" w:type="dxa"/>
+          </w:tcPr>
+          <w:tbl>
+            <w:tblPr>
+              <w:tblStyle w:val="TableGrid"/>
+              <w:tblW w:w="0" w:type="auto"/>
+              <w:shd w:val="clear" w:color="auto" w:fill="FFFFFF" w:themeFill="background1"/>
+              <w:tblLook w:val="04A0" w:firstRow="1" w:lastRow="0" w:firstColumn="1" w:lastColumn="0" w:noHBand="0" w:noVBand="1"/>
+            </w:tblPr>
+            <w:tblGrid>
+              <w:gridCol w:w="1762"/>
+              <w:gridCol w:w="1980"/>
+              <w:gridCol w:w="1440"/>
+            </w:tblGrid>
+            <w:tr>
+              <w:trPr>
+                <w:trHeight w:val="300"/>
+              </w:trPr>
+              <w:tc>
+                <w:tcPr>
+                  <w:tcW w:w="1762" w:type="dxa"/>
+                  <w:tcBorders>
+                    <w:left w:val="single" w:sz="4" w:space="0" w:color="auto"/>
+                    <w:right w:val="nil"/>
+                  </w:tcBorders>
+                  <w:shd w:val="clear" w:color="auto" w:fill="A8D08D" w:themeFill="accent6" w:themeFillTint="99"/>
+                </w:tcPr>
+                <w:p>
+                  <w:pPr>
+                    <w:rPr>
+                      <w:rFonts w:ascii="Times New Roman" w:hAnsi="Times New Roman" w:cs="Times New Roman"/>
+                      <w:b/>
+                      <w:bCs/>
+                    </w:rPr>
+                  </w:pPr>
+                  <w:r>
+                    <w:rPr>
+                      <w:rFonts w:ascii="Times New Roman" w:hAnsi="Times New Roman" w:cs="Times New Roman"/>
+                      <w:b/>
+                      <w:bCs/>
+                    </w:rPr>
+                    <w:t>AGENT:</w:t>
+                  </w:r>
+                </w:p>
+              </w:tc>
+              <w:tc>
+                <w:tcPr>
+                  <w:tcW w:w="3420" w:type="dxa"/>
+                  <w:gridSpan w:val="2"/>
+                  <w:tcBorders>
+                    <w:left w:val="nil"/>
+                  </w:tcBorders>
+                  <w:shd w:val="clear" w:color="auto" w:fill="FFFFFF" w:themeFill="background1"/>
+                </w:tcPr>
+                <w:p>
+                  <w:pPr>
+                    <w:rPr>
+                      <w:rFonts w:ascii="Times New Roman" w:hAnsi="Times New Roman" w:cs="Times New Roman"/>
+                      <w:b/>
+                      <w:bCs/>
+                    </w:rPr>
+                  </w:pPr>
+                </w:p>
+              </w:tc>
+            </w:tr>
+            <w:tr>
+              <w:trPr>
+                <w:trHeight w:val="136"/>
+              </w:trPr>
+              <w:tc>
+                <w:tcPr>
+                  <w:tcW w:w="1762" w:type="dxa"/>
+                  <w:tcBorders>
+                    <w:left w:val="single" w:sz="4" w:space="0" w:color="auto"/>
+                    <w:right w:val="single" w:sz="4" w:space="0" w:color="auto"/>
+                  </w:tcBorders>
+                  <w:shd w:val="clear" w:color="auto" w:fill="FFFFFF" w:themeFill="background1"/>
+                </w:tcPr>
+                <w:p>
+                  <w:pPr>
+                    <w:jc w:val="center"/>
+                    <w:rPr>
+                      <w:rFonts w:ascii="Times New Roman" w:hAnsi="Times New Roman" w:cs="Times New Roman"/>
+                    </w:rPr>
+                  </w:pPr>
+                  <w:r>
+                    <w:rPr>
+                      <w:rFonts w:ascii="Times New Roman" w:hAnsi="Times New Roman" w:cs="Times New Roman"/>
+                    </w:rPr>
+                    <w:t>Date:</w:t>
+                  </w:r>
+                </w:p>
+              </w:tc>
+              <w:tc>
+                <w:tcPr>
+                  <w:tcW w:w="1980" w:type="dxa"/>
+                  <w:tcBorders>
+                    <w:left w:val="single" w:sz="4" w:space="0" w:color="auto"/>
+                  </w:tcBorders>
+                  <w:shd w:val="clear" w:color="auto" w:fill="FFFFFF" w:themeFill="background1"/>
+                </w:tcPr>
+                <w:p>
+                  <w:pPr>
+                    <w:jc w:val="center"/>
+                    <w:rPr>
+                      <w:rFonts w:ascii="Times New Roman" w:hAnsi="Times New Roman" w:cs="Times New Roman"/>
+                    </w:rPr>
+                  </w:pPr>
+                  <w:r>
+                    <w:rPr>
+                      <w:rFonts w:ascii="Times New Roman" w:hAnsi="Times New Roman" w:cs="Times New Roman"/>
+                    </w:rPr>
+                    <w:t>Commission:</w:t>
+                  </w:r>
+                </w:p>
+              </w:tc>
+              <w:tc>
+                <w:tcPr>
+                  <w:tcW w:w="1440" w:type="dxa"/>
+                  <w:shd w:val="clear" w:color="auto" w:fill="FFFFFF" w:themeFill="background1"/>
+                </w:tcPr>
+                <w:p>
+                  <w:pPr>
+                    <w:jc w:val="center"/>
+                    <w:rPr>
+                      <w:rFonts w:ascii="Times New Roman" w:hAnsi="Times New Roman" w:cs="Times New Roman"/>
+                    </w:rPr>
+                  </w:pPr>
+                  <w:r>
+                    <w:rPr>
+                      <w:rFonts w:ascii="Times New Roman" w:hAnsi="Times New Roman" w:cs="Times New Roman"/>
+                    </w:rPr>
+                    <w:t>Signature</w:t>
+                  </w:r>
+                </w:p>
+              </w:tc>
+            </w:tr>
+            <w:tr>
+              <w:trPr>
+                <w:trHeight w:val="308"/>
+              </w:trPr>
+              <w:tc>
+                <w:tcPr>
+                  <w:tcW w:w="1762" w:type="dxa"/>
+                  <w:tcBorders>
+                    <w:left w:val="single" w:sz="4" w:space="0" w:color="auto"/>
+                    <w:right w:val="single" w:sz="4" w:space="0" w:color="auto"/>
+                  </w:tcBorders>
+                  <w:shd w:val="clear" w:color="auto" w:fill="FFFFFF" w:themeFill="background1"/>
+                </w:tcPr>
+                <w:p>
+                  <w:pPr>
+                    <w:tabs>
+                      <w:tab w:val="left" w:pos="69"/>
+                    </w:tabs>
+                    <w:ind w:left="-291" w:firstLine="33"/>
+                    <w:rPr>
+                      <w:rFonts w:ascii="Times New Roman" w:hAnsi="Times New Roman" w:cs="Times New Roman"/>
+                    </w:rPr>
+                  </w:pPr>
+                </w:p>
+              </w:tc>
+              <w:tc>
+                <w:tcPr>
+                  <w:tcW w:w="1980" w:type="dxa"/>
+                  <w:tcBorders>
+                    <w:left w:val="single" w:sz="4" w:space="0" w:color="auto"/>
+                  </w:tcBorders>
+                  <w:shd w:val="clear" w:color="auto" w:fill="FFFFFF" w:themeFill="background1"/>
+                </w:tcPr>
+                <w:p>
+                  <w:pPr>
+                    <w:rPr>
+                      <w:rFonts w:ascii="Times New Roman" w:hAnsi="Times New Roman" w:cs="Times New Roman"/>
+                    </w:rPr>
+                  </w:pPr>
+                </w:p>
+              </w:tc>
+              <w:tc>
+                <w:tcPr>
+                  <w:tcW w:w="1440" w:type="dxa"/>
+                  <w:shd w:val="clear" w:color="auto" w:fill="FFFFFF" w:themeFill="background1"/>
+                </w:tcPr>
+                <w:p>
+                  <w:pPr>
+                    <w:rPr>
+                      <w:rFonts w:ascii="Times New Roman" w:hAnsi="Times New Roman" w:cs="Times New Roman"/>
+                    </w:rPr>
+                  </w:pPr>
+                </w:p>
+              </w:tc>
+            </w:tr>
+            <w:tr>
+              <w:trPr>
+                <w:trHeight w:val="43"/>
+              </w:trPr>
+              <w:tc>
+                <w:tcPr>
+                  <w:tcW w:w="1762" w:type="dxa"/>
+                  <w:tcBorders>
+                    <w:left w:val="single" w:sz="4" w:space="0" w:color="auto"/>
+                    <w:right w:val="single" w:sz="4" w:space="0" w:color="auto"/>
+                  </w:tcBorders>
+                  <w:shd w:val="clear" w:color="auto" w:fill="FFFFFF" w:themeFill="background1"/>
+                </w:tcPr>
+                <w:p>
+                  <w:pPr>
+                    <w:rPr>
+                      <w:rFonts w:ascii="Times New Roman" w:hAnsi="Times New Roman" w:cs="Times New Roman"/>
+                    </w:rPr>
+                  </w:pPr>
+                </w:p>
+              </w:tc>
+              <w:tc>
+                <w:tcPr>
+                  <w:tcW w:w="1980" w:type="dxa"/>
+                  <w:tcBorders>
+                    <w:left w:val="single" w:sz="4" w:space="0" w:color="auto"/>
+                  </w:tcBorders>
+                  <w:shd w:val="clear" w:color="auto" w:fill="FFFFFF" w:themeFill="background1"/>
+                </w:tcPr>
+                <w:p>
+                  <w:pPr>
+                    <w:rPr>
+                      <w:rFonts w:ascii="Times New Roman" w:hAnsi="Times New Roman" w:cs="Times New Roman"/>
+                    </w:rPr>
+                  </w:pPr>
+                </w:p>
+              </w:tc>
+              <w:tc>
+                <w:tcPr>
+                  <w:tcW w:w="1440" w:type="dxa"/>
+                  <w:shd w:val="clear" w:color="auto" w:fill="FFFFFF" w:themeFill="background1"/>
+                </w:tcPr>
+                <w:p>
+                  <w:pPr>
+                    <w:rPr>
+                      <w:rFonts w:ascii="Times New Roman" w:hAnsi="Times New Roman" w:cs="Times New Roman"/>
+                    </w:rPr>
+                  </w:pPr>
+                </w:p>
+              </w:tc>
+            </w:tr>
+            <w:tr>
+              <w:trPr>
+                <w:trHeight w:val="164"/>
+              </w:trPr>
+              <w:tc>
+                <w:tcPr>
+                  <w:tcW w:w="1762" w:type="dxa"/>
+                  <w:tcBorders>
+                    <w:left w:val="single" w:sz="4" w:space="0" w:color="auto"/>
+                    <w:right w:val="nil"/>
+                  </w:tcBorders>
+                  <w:shd w:val="clear" w:color="auto" w:fill="A8D08D" w:themeFill="accent6" w:themeFillTint="99"/>
+                </w:tcPr>
+                <w:p>
+                  <w:pPr>
+                    <w:rPr>
+                      <w:rFonts w:ascii="Times New Roman" w:hAnsi="Times New Roman" w:cs="Times New Roman"/>
+                      <w:b/>
+                      <w:bCs/>
+                    </w:rPr>
+                  </w:pPr>
+                  <w:r>
+                    <w:rPr>
+                      <w:rFonts w:ascii="Times New Roman" w:hAnsi="Times New Roman" w:cs="Times New Roman"/>
+                      <w:b/>
+                      <w:bCs/>
+                    </w:rPr>
+                    <w:t>BROKER:</w:t>
+                  </w:r>
+                </w:p>
+              </w:tc>
+              <w:tc>
+                <w:tcPr>
+                  <w:tcW w:w="3420" w:type="dxa"/>
+                  <w:gridSpan w:val="2"/>
+                  <w:tcBorders>
+                    <w:left w:val="nil"/>
+                  </w:tcBorders>
+                  <w:shd w:val="clear" w:color="auto" w:fill="FFFFFF" w:themeFill="background1"/>
+                </w:tcPr>
+                <w:p>
+                  <w:pPr>
+                    <w:rPr>
+                      <w:rFonts w:ascii="Times New Roman" w:hAnsi="Times New Roman" w:cs="Times New Roman"/>
+                      <w:b/>
+                      <w:bCs/>
+                    </w:rPr>
+                  </w:pPr>
+                </w:p>
+              </w:tc>
+            </w:tr>
+            <w:tr>
+              <w:trPr>
+                <w:trHeight w:val="43"/>
+              </w:trPr>
+              <w:tc>
+                <w:tcPr>
+                  <w:tcW w:w="1762" w:type="dxa"/>
+                  <w:tcBorders>
+                    <w:left w:val="single" w:sz="4" w:space="0" w:color="auto"/>
+                    <w:right w:val="single" w:sz="4" w:space="0" w:color="auto"/>
+                  </w:tcBorders>
+                  <w:shd w:val="clear" w:color="auto" w:fill="FFFFFF" w:themeFill="background1"/>
+                </w:tcPr>
+                <w:p>
+                  <w:pPr>
+                    <w:rPr>
+                      <w:rFonts w:ascii="Times New Roman" w:hAnsi="Times New Roman" w:cs="Times New Roman"/>
+                    </w:rPr>
+                  </w:pPr>
+                </w:p>
+              </w:tc>
+              <w:tc>
+                <w:tcPr>
+                  <w:tcW w:w="1980" w:type="dxa"/>
+                  <w:tcBorders>
+                    <w:left w:val="single" w:sz="4" w:space="0" w:color="auto"/>
+                  </w:tcBorders>
+                  <w:shd w:val="clear" w:color="auto" w:fill="FFFFFF" w:themeFill="background1"/>
+                </w:tcPr>
+                <w:p>
+                  <w:pPr>
+                    <w:rPr>
+                      <w:rFonts w:ascii="Times New Roman" w:hAnsi="Times New Roman" w:cs="Times New Roman"/>
+                    </w:rPr>
+                  </w:pPr>
+                </w:p>
+              </w:tc>
+              <w:tc>
+                <w:tcPr>
+                  <w:tcW w:w="1440" w:type="dxa"/>
+                  <w:shd w:val="clear" w:color="auto" w:fill="FFFFFF" w:themeFill="background1"/>
+                </w:tcPr>
+                <w:p>
+                  <w:pPr>
+                    <w:rPr>
+                      <w:rFonts w:ascii="Times New Roman" w:hAnsi="Times New Roman" w:cs="Times New Roman"/>
+                    </w:rPr>
+                  </w:pPr>
+                </w:p>
+              </w:tc>
+            </w:tr>
+            <w:tr>
+              <w:trPr>
+                <w:trHeight w:val="297"/>
+              </w:trPr>
+              <w:tc>
+                <w:tcPr>
+                  <w:tcW w:w="1762" w:type="dxa"/>
+                  <w:tcBorders>
+                    <w:left w:val="single" w:sz="4" w:space="0" w:color="auto"/>
+                    <w:right w:val="single" w:sz="4" w:space="0" w:color="auto"/>
+                  </w:tcBorders>
+                  <w:shd w:val="clear" w:color="auto" w:fill="FFFFFF" w:themeFill="background1"/>
+                </w:tcPr>
+                <w:p>
+                  <w:pPr>
+                    <w:rPr>
+                      <w:rFonts w:ascii="Times New Roman" w:hAnsi="Times New Roman" w:cs="Times New Roman"/>
+                    </w:rPr>
+                  </w:pPr>
+                </w:p>
+              </w:tc>
+              <w:tc>
+                <w:tcPr>
+                  <w:tcW w:w="1980" w:type="dxa"/>
+                  <w:tcBorders>
+                    <w:left w:val="single" w:sz="4" w:space="0" w:color="auto"/>
+                  </w:tcBorders>
+                  <w:shd w:val="clear" w:color="auto" w:fill="FFFFFF" w:themeFill="background1"/>
+                </w:tcPr>
+                <w:p>
+                  <w:pPr>
+                    <w:rPr>
+                      <w:rFonts w:ascii="Times New Roman" w:hAnsi="Times New Roman" w:cs="Times New Roman"/>
+                    </w:rPr>
+                  </w:pPr>
+                </w:p>
+              </w:tc>
+              <w:tc>
+                <w:tcPr>
+                  <w:tcW w:w="1440" w:type="dxa"/>
+                  <w:shd w:val="clear" w:color="auto" w:fill="FFFFFF" w:themeFill="background1"/>
+                </w:tcPr>
+                <w:p>
+                  <w:pPr>
+                    <w:rPr>
+                      <w:rFonts w:ascii="Times New Roman" w:hAnsi="Times New Roman" w:cs="Times New Roman"/>
+                    </w:rPr>
+                  </w:pPr>
+                </w:p>
+              </w:tc>
+            </w:tr>
+          </w:tbl>
+          <w:p>
+            <w:pPr>
+              <w:spacing w:before="0" w:after="0" w:line="20" w:lineRule="exact"/>
+              <w:rPr>
+                <w:sz w:val="2"/>
+              </w:rPr>
+            </w:pPr>
+          </w:p>
+        </w:tc>
+      </w:tr>
+    </w:tbl>
+    <w:p>
+      <w:pPr>
+        <w:spacing w:before="0" w:after="0" w:line="100" w:lineRule="exact"/>
+        <w:rPr>
+          <w:sz w:val="2"/>
+        </w:rPr>
+      </w:pPr>
+    </w:p>
     <w:tbl>
       <w:tblPr>
         <w:tblStyle w:val="TableGrid"/>
-        <w:tblpPr w:leftFromText="180" w:rightFromText="180" w:vertAnchor="text" w:horzAnchor="margin" w:tblpX="-289" w:tblpY="1044"/>
-        <w:tblOverlap w:val="never"/>
-        <w:tblW w:w="10177" w:type="dxa"/>
-        <w:shd w:val="clear" w:color="auto" w:fill="FFFFFF" w:themeFill="background1"/>
-        <w:tblLook w:val="04A0" w:firstRow="1" w:lastRow="0" w:firstColumn="1" w:lastColumn="0" w:noHBand="0" w:noVBand="1"/>
-      </w:tblPr>
-      <w:tblGrid>
-        <w:gridCol w:w="2155"/>
-        <w:gridCol w:w="2802"/>
-        <w:gridCol w:w="236"/>
-        <w:gridCol w:w="2104"/>
-        <w:gridCol w:w="2880"/>
-      </w:tblGrid>
-      <w:tr>
-        <w:trPr>
-          <w:trHeight w:val="396"/>
-        </w:trPr>
-        <w:tc>
-          <w:tcPr>
-            <w:tcW w:w="2155" w:type="dxa"/>
-            <w:tcBorders>
-              <w:left w:val="single" w:sz="4" w:space="0" w:color="auto"/>
-              <w:right w:val="nil"/>
-            </w:tcBorders>
-            <w:shd w:val="clear" w:color="auto" w:fill="A8D08D" w:themeFill="accent6" w:themeFillTint="99"/>
-            <w:vAlign w:val="center"/>
-          </w:tcPr>
-          <w:p>
-            <w:pPr>
-              <w:rPr>
-                <w:rFonts w:ascii="Times New Roman" w:hAnsi="Times New Roman" w:cs="Times New Roman"/>
-                <w:b/>
-                <w:bCs/>
-                <w:sz w:val="20"/>
-                <w:szCs w:val="20"/>
-              </w:rPr>
-            </w:pPr>
-            <w:r>
-              <w:rPr>
-                <w:rFonts w:ascii="Times New Roman" w:hAnsi="Times New Roman" w:cs="Times New Roman"/>
-                <w:b/>
-                <w:bCs/>
-                <w:sz w:val="20"/>
-                <w:szCs w:val="20"/>
-              </w:rPr>
-              <w:t>NAME:</w:t>
-            </w:r>
-          </w:p>
-        </w:tc>
-        <w:tc>
-          <w:tcPr>
-            <w:tcW w:w="2802" w:type="dxa"/>
-            <w:tcBorders>
-              <w:left w:val="nil"/>
-              <w:right w:val="single" w:sz="4" w:space="0" w:color="auto"/>
-            </w:tcBorders>
-            <w:shd w:val="clear" w:color="auto" w:fill="FFFFFF" w:themeFill="background1"/>
-            <w:vAlign w:val="center"/>
-          </w:tcPr>
-          <w:p>
-            <w:pPr>
-              <w:rPr>
-                <w:rFonts w:ascii="Times New Roman" w:hAnsi="Times New Roman" w:cs="Times New Roman"/>
-                <w:b/>
-                <w:bCs/>
-              </w:rPr>
-            </w:pPr>
-          </w:p>
-        </w:tc>
-        <w:tc>
-          <w:tcPr>
-            <w:tcW w:w="236" w:type="dxa"/>
-            <w:tcBorders>
-              <w:top w:val="nil"/>
-              <w:left w:val="single" w:sz="4" w:space="0" w:color="auto"/>
-              <w:bottom w:val="nil"/>
-              <w:right w:val="single" w:sz="4" w:space="0" w:color="auto"/>
-            </w:tcBorders>
-            <w:vAlign w:val="center"/>
-          </w:tcPr>
-          <w:p>
-            <w:pPr>
-              <w:rPr>
-                <w:rFonts w:ascii="Times New Roman" w:hAnsi="Times New Roman" w:cs="Times New Roman"/>
-                <w:b/>
-                <w:bCs/>
-              </w:rPr>
-            </w:pPr>
-            <w:r>
-              <w:rPr>
-                <w:rFonts w:ascii="Times New Roman" w:hAnsi="Times New Roman" w:cs="Times New Roman"/>
-                <w:b/>
-                <w:bCs/>
-              </w:rPr>
-              <w:t xml:space="preserve">  </w:t>
-            </w:r>
-          </w:p>
-        </w:tc>
-        <w:tc>
-          <w:tcPr>
-            <w:tcW w:w="2104" w:type="dxa"/>
-            <w:tcBorders>
-              <w:left w:val="single" w:sz="4" w:space="0" w:color="auto"/>
-              <w:right w:val="nil"/>
-            </w:tcBorders>
-            <w:shd w:val="clear" w:color="auto" w:fill="A8D08D" w:themeFill="accent6" w:themeFillTint="99"/>
-            <w:vAlign w:val="center"/>
-          </w:tcPr>
-          <w:p>
-            <w:pPr>
-              <w:rPr>
-                <w:rFonts w:ascii="Times New Roman" w:hAnsi="Times New Roman" w:cs="Times New Roman"/>
-                <w:b/>
-                <w:bCs/>
-              </w:rPr>
-            </w:pPr>
-            <w:r>
-              <w:rPr>
-                <w:rFonts w:ascii="Times New Roman" w:hAnsi="Times New Roman" w:cs="Times New Roman"/>
-                <w:b/>
-                <w:bCs/>
-              </w:rPr>
-              <w:t>CONTACT NO.:</w:t>
-            </w:r>
-          </w:p>
-        </w:tc>
-        <w:tc>
-          <w:tcPr>
-            <w:tcW w:w="2880" w:type="dxa"/>
-            <w:tcBorders>
-              <w:top w:val="single" w:sz="4" w:space="0" w:color="auto"/>
-              <w:left w:val="nil"/>
-              <w:bottom w:val="single" w:sz="4" w:space="0" w:color="auto"/>
-              <w:right w:val="single" w:sz="4" w:space="0" w:color="auto"/>
-            </w:tcBorders>
-            <w:shd w:val="clear" w:color="auto" w:fill="FFFFFF" w:themeFill="background1"/>
-          </w:tcPr>
-          <w:p>
-            <w:pPr>
-              <w:rPr>
-                <w:rFonts w:ascii="Times New Roman" w:hAnsi="Times New Roman" w:cs="Times New Roman"/>
-                <w:b/>
-                <w:bCs/>
-              </w:rPr>
-            </w:pPr>
-          </w:p>
-        </w:tc>
-      </w:tr>
-      <w:tr>
-        <w:trPr>
-          <w:trHeight w:val="396"/>
-        </w:trPr>
-        <w:tc>
-          <w:tcPr>
-            <w:tcW w:w="2155" w:type="dxa"/>
-            <w:tcBorders>
-              <w:left w:val="single" w:sz="4" w:space="0" w:color="auto"/>
-              <w:right w:val="nil"/>
-            </w:tcBorders>
-            <w:shd w:val="clear" w:color="auto" w:fill="A8D08D" w:themeFill="accent6" w:themeFillTint="99"/>
-          </w:tcPr>
-          <w:p>
-            <w:pPr>
-              <w:rPr>
-                <w:rFonts w:ascii="Times New Roman" w:hAnsi="Times New Roman" w:cs="Times New Roman"/>
-                <w:b/>
-                <w:bCs/>
-                <w:sz w:val="20"/>
-                <w:szCs w:val="20"/>
-              </w:rPr>
-            </w:pPr>
-            <w:r>
-              <w:rPr>
-                <w:rFonts w:ascii="Times New Roman" w:hAnsi="Times New Roman" w:cs="Times New Roman"/>
-                <w:b/>
-                <w:bCs/>
-                <w:sz w:val="20"/>
-                <w:szCs w:val="20"/>
-              </w:rPr>
-              <w:t>BLOCK:</w:t>
-            </w:r>
-          </w:p>
-        </w:tc>
-        <w:tc>
-          <w:tcPr>
-            <w:tcW w:w="2802" w:type="dxa"/>
-            <w:tcBorders>
-              <w:left w:val="nil"/>
-              <w:right w:val="single" w:sz="4" w:space="0" w:color="auto"/>
-            </w:tcBorders>
-            <w:shd w:val="clear" w:color="auto" w:fill="FFFFFF" w:themeFill="background1"/>
-            <w:vAlign w:val="center"/>
-          </w:tcPr>
-          <w:p>
-            <w:pPr>
-              <w:rPr>
-                <w:rFonts w:ascii="Times New Roman" w:hAnsi="Times New Roman" w:cs="Times New Roman"/>
-                <w:b/>
-                <w:bCs/>
-              </w:rPr>
-            </w:pPr>
-          </w:p>
-        </w:tc>
-        <w:tc>
-          <w:tcPr>
-            <w:tcW w:w="236" w:type="dxa"/>
-            <w:tcBorders>
-              <w:top w:val="nil"/>
-              <w:left w:val="single" w:sz="4" w:space="0" w:color="auto"/>
-              <w:bottom w:val="nil"/>
-              <w:right w:val="single" w:sz="4" w:space="0" w:color="auto"/>
-            </w:tcBorders>
-            <w:vAlign w:val="center"/>
-          </w:tcPr>
-          <w:p>
-            <w:pPr>
-              <w:rPr>
-                <w:rFonts w:ascii="Times New Roman" w:hAnsi="Times New Roman" w:cs="Times New Roman"/>
-                <w:b/>
-                <w:bCs/>
-              </w:rPr>
-            </w:pPr>
-          </w:p>
-        </w:tc>
-        <w:tc>
-          <w:tcPr>
-            <w:tcW w:w="2104" w:type="dxa"/>
-            <w:tcBorders>
-              <w:left w:val="single" w:sz="4" w:space="0" w:color="auto"/>
-              <w:right w:val="nil"/>
-            </w:tcBorders>
-            <w:shd w:val="clear" w:color="auto" w:fill="A8D08D" w:themeFill="accent6" w:themeFillTint="99"/>
-            <w:vAlign w:val="center"/>
-          </w:tcPr>
-          <w:p>
-            <w:pPr>
-              <w:rPr>
-                <w:rFonts w:ascii="Times New Roman" w:hAnsi="Times New Roman" w:cs="Times New Roman"/>
-                <w:b/>
-                <w:bCs/>
-              </w:rPr>
-            </w:pPr>
-            <w:r>
-              <w:rPr>
-                <w:rFonts w:ascii="Times New Roman" w:hAnsi="Times New Roman" w:cs="Times New Roman"/>
-                <w:b/>
-                <w:bCs/>
-              </w:rPr>
-              <w:t>LOT TYPE:</w:t>
-            </w:r>
-          </w:p>
-        </w:tc>
-        <w:tc>
-          <w:tcPr>
-            <w:tcW w:w="2880" w:type="dxa"/>
-            <w:tcBorders>
-              <w:top w:val="single" w:sz="4" w:space="0" w:color="auto"/>
-              <w:left w:val="nil"/>
-              <w:bottom w:val="single" w:sz="4" w:space="0" w:color="auto"/>
-              <w:right w:val="single" w:sz="4" w:space="0" w:color="auto"/>
-            </w:tcBorders>
-            <w:shd w:val="clear" w:color="auto" w:fill="FFFFFF" w:themeFill="background1"/>
-          </w:tcPr>
-          <w:p>
-            <w:pPr>
-              <w:rPr>
-                <w:rFonts w:ascii="Times New Roman" w:hAnsi="Times New Roman" w:cs="Times New Roman"/>
-                <w:b/>
-                <w:bCs/>
-              </w:rPr>
-            </w:pPr>
-          </w:p>
-        </w:tc>
-      </w:tr>
-      <w:tr>
-        <w:trPr>
-          <w:trHeight w:val="396"/>
-        </w:trPr>
-        <w:tc>
-          <w:tcPr>
-            <w:tcW w:w="2155" w:type="dxa"/>
-            <w:tcBorders>
-              <w:left w:val="single" w:sz="4" w:space="0" w:color="auto"/>
-              <w:right w:val="nil"/>
-            </w:tcBorders>
-            <w:shd w:val="clear" w:color="auto" w:fill="A8D08D" w:themeFill="accent6" w:themeFillTint="99"/>
-          </w:tcPr>
-          <w:p>
-            <w:pPr>
-              <w:rPr>
-                <w:rFonts w:ascii="Times New Roman" w:hAnsi="Times New Roman" w:cs="Times New Roman"/>
-                <w:b/>
-                <w:bCs/>
-                <w:sz w:val="20"/>
-                <w:szCs w:val="20"/>
-              </w:rPr>
-            </w:pPr>
-            <w:r>
-              <w:rPr>
-                <w:rFonts w:ascii="Times New Roman" w:hAnsi="Times New Roman" w:cs="Times New Roman"/>
-                <w:b/>
-                <w:bCs/>
-                <w:sz w:val="20"/>
-                <w:szCs w:val="20"/>
-              </w:rPr>
-              <w:t>LOT NO.:</w:t>
-            </w:r>
-          </w:p>
-        </w:tc>
-        <w:tc>
-          <w:tcPr>
-            <w:tcW w:w="2802" w:type="dxa"/>
-            <w:tcBorders>
-              <w:left w:val="nil"/>
-              <w:right w:val="single" w:sz="4" w:space="0" w:color="auto"/>
-            </w:tcBorders>
-            <w:shd w:val="clear" w:color="auto" w:fill="FFFFFF" w:themeFill="background1"/>
-            <w:vAlign w:val="center"/>
-          </w:tcPr>
-          <w:p>
-            <w:pPr>
-              <w:rPr>
-                <w:rFonts w:ascii="Times New Roman" w:hAnsi="Times New Roman" w:cs="Times New Roman"/>
-                <w:b/>
-                <w:bCs/>
-              </w:rPr>
-            </w:pPr>
-          </w:p>
-        </w:tc>
-        <w:tc>
-          <w:tcPr>
-            <w:tcW w:w="236" w:type="dxa"/>
-            <w:tcBorders>
-              <w:top w:val="nil"/>
-              <w:left w:val="single" w:sz="4" w:space="0" w:color="auto"/>
-              <w:bottom w:val="nil"/>
-              <w:right w:val="single" w:sz="4" w:space="0" w:color="auto"/>
-            </w:tcBorders>
-            <w:vAlign w:val="center"/>
-          </w:tcPr>
-          <w:p>
-            <w:pPr>
-              <w:rPr>
-                <w:rFonts w:ascii="Times New Roman" w:hAnsi="Times New Roman" w:cs="Times New Roman"/>
-                <w:b/>
-                <w:bCs/>
-              </w:rPr>
-            </w:pPr>
-          </w:p>
-        </w:tc>
-        <w:tc>
-          <w:tcPr>
-            <w:tcW w:w="2104" w:type="dxa"/>
-            <w:tcBorders>
-              <w:left w:val="single" w:sz="4" w:space="0" w:color="auto"/>
-              <w:right w:val="nil"/>
-            </w:tcBorders>
-            <w:shd w:val="clear" w:color="auto" w:fill="A8D08D" w:themeFill="accent6" w:themeFillTint="99"/>
-            <w:vAlign w:val="center"/>
-          </w:tcPr>
-          <w:p>
-            <w:pPr>
-              <w:rPr>
-                <w:rFonts w:ascii="Times New Roman" w:hAnsi="Times New Roman" w:cs="Times New Roman"/>
-                <w:b/>
-                <w:bCs/>
-              </w:rPr>
-            </w:pPr>
-            <w:r>
-              <w:rPr>
-                <w:rFonts w:ascii="Times New Roman" w:hAnsi="Times New Roman" w:cs="Times New Roman"/>
-                <w:b/>
-                <w:bCs/>
-              </w:rPr>
-              <w:t>PHASE NO.:</w:t>
-            </w:r>
-          </w:p>
-        </w:tc>
-        <w:tc>
-          <w:tcPr>
-            <w:tcW w:w="2880" w:type="dxa"/>
-            <w:tcBorders>
-              <w:top w:val="single" w:sz="4" w:space="0" w:color="auto"/>
-              <w:left w:val="nil"/>
-              <w:bottom w:val="single" w:sz="4" w:space="0" w:color="auto"/>
-              <w:right w:val="single" w:sz="4" w:space="0" w:color="auto"/>
-            </w:tcBorders>
-            <w:shd w:val="clear" w:color="auto" w:fill="FFFFFF" w:themeFill="background1"/>
-          </w:tcPr>
-          <w:p>
-            <w:pPr>
-              <w:rPr>
-                <w:rFonts w:ascii="Times New Roman" w:hAnsi="Times New Roman" w:cs="Times New Roman"/>
-                <w:b/>
-                <w:bCs/>
-              </w:rPr>
-            </w:pPr>
-          </w:p>
-        </w:tc>
-      </w:tr>
-      <w:tr>
-        <w:trPr>
-          <w:trHeight w:val="396"/>
-        </w:trPr>
-        <w:tc>
-          <w:tcPr>
-            <w:tcW w:w="2155" w:type="dxa"/>
-            <w:tcBorders>
-              <w:left w:val="single" w:sz="4" w:space="0" w:color="auto"/>
-              <w:right w:val="nil"/>
-            </w:tcBorders>
-            <w:shd w:val="clear" w:color="auto" w:fill="A8D08D" w:themeFill="accent6" w:themeFillTint="99"/>
-          </w:tcPr>
-          <w:p>
-            <w:pPr>
-              <w:rPr>
-                <w:rFonts w:ascii="Times New Roman" w:hAnsi="Times New Roman" w:cs="Times New Roman"/>
-                <w:b/>
-                <w:bCs/>
-                <w:sz w:val="20"/>
-                <w:szCs w:val="20"/>
-              </w:rPr>
-            </w:pPr>
-            <w:r>
-              <w:rPr>
-                <w:rFonts w:ascii="Times New Roman" w:hAnsi="Times New Roman" w:cs="Times New Roman"/>
-                <w:b/>
-                <w:bCs/>
-                <w:sz w:val="20"/>
-                <w:szCs w:val="20"/>
-              </w:rPr>
-              <w:t>CONTRACT PRICE:</w:t>
-            </w:r>
-          </w:p>
-        </w:tc>
-        <w:tc>
-          <w:tcPr>
-            <w:tcW w:w="2802" w:type="dxa"/>
-            <w:tcBorders>
-              <w:left w:val="nil"/>
-              <w:right w:val="single" w:sz="4" w:space="0" w:color="auto"/>
-            </w:tcBorders>
-            <w:shd w:val="clear" w:color="auto" w:fill="FFFFFF" w:themeFill="background1"/>
-            <w:vAlign w:val="center"/>
-          </w:tcPr>
-          <w:p>
-            <w:pPr>
-              <w:rPr>
-                <w:rFonts w:ascii="Times New Roman" w:hAnsi="Times New Roman" w:cs="Times New Roman"/>
-                <w:b/>
-                <w:bCs/>
-              </w:rPr>
-            </w:pPr>
-          </w:p>
-        </w:tc>
-        <w:tc>
-          <w:tcPr>
-            <w:tcW w:w="236" w:type="dxa"/>
-            <w:tcBorders>
-              <w:top w:val="nil"/>
-              <w:left w:val="single" w:sz="4" w:space="0" w:color="auto"/>
-              <w:bottom w:val="nil"/>
-              <w:right w:val="single" w:sz="4" w:space="0" w:color="auto"/>
-            </w:tcBorders>
-            <w:vAlign w:val="center"/>
-          </w:tcPr>
-          <w:p>
-            <w:pPr>
-              <w:rPr>
-                <w:rFonts w:ascii="Times New Roman" w:hAnsi="Times New Roman" w:cs="Times New Roman"/>
-                <w:b/>
-                <w:bCs/>
-              </w:rPr>
-            </w:pPr>
-          </w:p>
-        </w:tc>
-        <w:tc>
-          <w:tcPr>
-            <w:tcW w:w="2104" w:type="dxa"/>
-            <w:tcBorders>
-              <w:left w:val="single" w:sz="4" w:space="0" w:color="auto"/>
-              <w:right w:val="nil"/>
-            </w:tcBorders>
-            <w:shd w:val="clear" w:color="auto" w:fill="A8D08D" w:themeFill="accent6" w:themeFillTint="99"/>
-            <w:vAlign w:val="center"/>
-          </w:tcPr>
-          <w:p>
-            <w:pPr>
-              <w:rPr>
-                <w:rFonts w:ascii="Times New Roman" w:hAnsi="Times New Roman" w:cs="Times New Roman"/>
-                <w:b/>
-                <w:bCs/>
-              </w:rPr>
-            </w:pPr>
-            <w:r>
-              <w:rPr>
-                <w:rFonts w:ascii="Times New Roman" w:hAnsi="Times New Roman" w:cs="Times New Roman"/>
-                <w:b/>
-                <w:bCs/>
-              </w:rPr>
-              <w:t>YEAR CONRACT:</w:t>
-            </w:r>
-          </w:p>
-        </w:tc>
-        <w:tc>
-          <w:tcPr>
-            <w:tcW w:w="2880" w:type="dxa"/>
-            <w:tcBorders>
-              <w:top w:val="single" w:sz="4" w:space="0" w:color="auto"/>
-              <w:left w:val="nil"/>
-              <w:bottom w:val="single" w:sz="4" w:space="0" w:color="auto"/>
-              <w:right w:val="single" w:sz="4" w:space="0" w:color="auto"/>
-            </w:tcBorders>
-            <w:shd w:val="clear" w:color="auto" w:fill="FFFFFF" w:themeFill="background1"/>
-          </w:tcPr>
-          <w:p>
-            <w:pPr>
-              <w:rPr>
-                <w:rFonts w:ascii="Times New Roman" w:hAnsi="Times New Roman" w:cs="Times New Roman"/>
-                <w:b/>
-                <w:bCs/>
-              </w:rPr>
-            </w:pPr>
-          </w:p>
-        </w:tc>
-      </w:tr>
-      <w:tr>
-        <w:trPr>
-          <w:trHeight w:val="396"/>
-        </w:trPr>
-        <w:tc>
-          <w:tcPr>
-            <w:tcW w:w="2155" w:type="dxa"/>
-            <w:tcBorders>
-              <w:left w:val="single" w:sz="4" w:space="0" w:color="auto"/>
-              <w:right w:val="nil"/>
-            </w:tcBorders>
-            <w:shd w:val="clear" w:color="auto" w:fill="A8D08D" w:themeFill="accent6" w:themeFillTint="99"/>
-          </w:tcPr>
-          <w:p>
-            <w:pPr>
-              <w:rPr>
-                <w:rFonts w:ascii="Times New Roman" w:hAnsi="Times New Roman" w:cs="Times New Roman"/>
-                <w:b/>
-                <w:bCs/>
-                <w:sz w:val="20"/>
-                <w:szCs w:val="20"/>
-              </w:rPr>
-            </w:pPr>
-            <w:r>
-              <w:rPr>
-                <w:rFonts w:ascii="Times New Roman" w:hAnsi="Times New Roman" w:cs="Times New Roman"/>
-                <w:b/>
-                <w:bCs/>
-                <w:sz w:val="20"/>
-                <w:szCs w:val="20"/>
-              </w:rPr>
-              <w:t>DATE:</w:t>
-            </w:r>
-          </w:p>
-        </w:tc>
-        <w:tc>
-          <w:tcPr>
-            <w:tcW w:w="2802" w:type="dxa"/>
-            <w:tcBorders>
-              <w:left w:val="nil"/>
-              <w:right w:val="single" w:sz="4" w:space="0" w:color="auto"/>
-            </w:tcBorders>
-            <w:shd w:val="clear" w:color="auto" w:fill="FFFFFF" w:themeFill="background1"/>
-            <w:vAlign w:val="center"/>
-          </w:tcPr>
-          <w:p>
-            <w:pPr>
-              <w:rPr>
-                <w:rFonts w:ascii="Times New Roman" w:hAnsi="Times New Roman" w:cs="Times New Roman"/>
-                <w:b/>
-                <w:bCs/>
-              </w:rPr>
-            </w:pPr>
-          </w:p>
-        </w:tc>
-        <w:tc>
-          <w:tcPr>
-            <w:tcW w:w="236" w:type="dxa"/>
-            <w:tcBorders>
-              <w:top w:val="nil"/>
-              <w:left w:val="single" w:sz="4" w:space="0" w:color="auto"/>
-              <w:bottom w:val="nil"/>
-              <w:right w:val="single" w:sz="4" w:space="0" w:color="auto"/>
-            </w:tcBorders>
-            <w:vAlign w:val="center"/>
-          </w:tcPr>
-          <w:p>
-            <w:pPr>
-              <w:rPr>
-                <w:rFonts w:ascii="Times New Roman" w:hAnsi="Times New Roman" w:cs="Times New Roman"/>
-                <w:b/>
-                <w:bCs/>
-              </w:rPr>
-            </w:pPr>
-          </w:p>
-        </w:tc>
-        <w:tc>
-          <w:tcPr>
-            <w:tcW w:w="2104" w:type="dxa"/>
-            <w:tcBorders>
-              <w:left w:val="single" w:sz="4" w:space="0" w:color="auto"/>
-              <w:right w:val="nil"/>
-            </w:tcBorders>
-            <w:shd w:val="clear" w:color="auto" w:fill="A8D08D" w:themeFill="accent6" w:themeFillTint="99"/>
-            <w:vAlign w:val="center"/>
-          </w:tcPr>
-          <w:p>
-            <w:pPr>
-              <w:rPr>
-                <w:rFonts w:ascii="Times New Roman" w:hAnsi="Times New Roman" w:cs="Times New Roman"/>
-                <w:b/>
-                <w:bCs/>
-              </w:rPr>
-            </w:pPr>
-            <w:r>
-              <w:rPr>
-                <w:rFonts w:ascii="Times New Roman" w:hAnsi="Times New Roman" w:cs="Times New Roman"/>
-                <w:b/>
-                <w:bCs/>
-              </w:rPr>
-              <w:t>AMOUNT:</w:t>
-            </w:r>
-          </w:p>
-        </w:tc>
-        <w:tc>
-          <w:tcPr>
-            <w:tcW w:w="2880" w:type="dxa"/>
-            <w:tcBorders>
-              <w:top w:val="single" w:sz="4" w:space="0" w:color="auto"/>
-              <w:left w:val="nil"/>
-              <w:bottom w:val="single" w:sz="4" w:space="0" w:color="auto"/>
-              <w:right w:val="single" w:sz="4" w:space="0" w:color="auto"/>
-            </w:tcBorders>
-            <w:shd w:val="clear" w:color="auto" w:fill="FFFFFF" w:themeFill="background1"/>
-          </w:tcPr>
-          <w:p>
-            <w:pPr>
-              <w:rPr>
-                <w:rFonts w:ascii="Times New Roman" w:hAnsi="Times New Roman" w:cs="Times New Roman"/>
-                <w:b/>
-                <w:bCs/>
-              </w:rPr>
-            </w:pPr>
-          </w:p>
-        </w:tc>
-      </w:tr>
-    </w:tbl>
-    <w:tbl>
-      <w:tblPr>
-        <w:tblStyle w:val="TableGrid"/>
-        <w:tblpPr w:leftFromText="180" w:rightFromText="180" w:vertAnchor="text" w:horzAnchor="page" w:tblpX="10880" w:tblpY="650"/>
-        <w:tblW w:w="0" w:type="auto"/>
-        <w:shd w:val="clear" w:color="auto" w:fill="FFFFFF" w:themeFill="background1"/>
-        <w:tblLook w:val="04A0" w:firstRow="1" w:lastRow="0" w:firstColumn="1" w:lastColumn="0" w:noHBand="0" w:noVBand="1"/>
-      </w:tblPr>
-      <w:tblGrid>
-        <w:gridCol w:w="1762"/>
-        <w:gridCol w:w="1980"/>
-        <w:gridCol w:w="1440"/>
-      </w:tblGrid>
-      <w:tr>
-        <w:trPr>
-          <w:trHeight w:val="300"/>
-        </w:trPr>
-        <w:tc>
-          <w:tcPr>
-            <w:tcW w:w="1762" w:type="dxa"/>
-            <w:tcBorders>
-              <w:left w:val="single" w:sz="4" w:space="0" w:color="auto"/>
-              <w:right w:val="nil"/>
-            </w:tcBorders>
-            <w:shd w:val="clear" w:color="auto" w:fill="A8D08D" w:themeFill="accent6" w:themeFillTint="99"/>
-          </w:tcPr>
-          <w:p>
-            <w:pPr>
-              <w:rPr>
-                <w:rFonts w:ascii="Times New Roman" w:hAnsi="Times New Roman" w:cs="Times New Roman"/>
-                <w:b/>
-                <w:bCs/>
-              </w:rPr>
-            </w:pPr>
-            <w:r>
-              <w:rPr>
-                <w:rFonts w:ascii="Times New Roman" w:hAnsi="Times New Roman" w:cs="Times New Roman"/>
-                <w:b/>
-                <w:bCs/>
-              </w:rPr>
-              <w:t>AGENT:</w:t>
-            </w:r>
-          </w:p>
-        </w:tc>
-        <w:tc>
-          <w:tcPr>
-            <w:tcW w:w="3420" w:type="dxa"/>
-            <w:gridSpan w:val="2"/>
-            <w:tcBorders>
-              <w:left w:val="nil"/>
-            </w:tcBorders>
-            <w:shd w:val="clear" w:color="auto" w:fill="FFFFFF" w:themeFill="background1"/>
-          </w:tcPr>
-          <w:p>
-            <w:pPr>
-              <w:rPr>
-                <w:rFonts w:ascii="Times New Roman" w:hAnsi="Times New Roman" w:cs="Times New Roman"/>
-                <w:b/>
-                <w:bCs/>
-              </w:rPr>
-            </w:pPr>
-          </w:p>
-        </w:tc>
-      </w:tr>
-      <w:tr>
-        <w:trPr>
-          <w:trHeight w:val="136"/>
-        </w:trPr>
-        <w:tc>
-          <w:tcPr>
-            <w:tcW w:w="1762" w:type="dxa"/>
-            <w:tcBorders>
-              <w:left w:val="single" w:sz="4" w:space="0" w:color="auto"/>
-              <w:right w:val="single" w:sz="4" w:space="0" w:color="auto"/>
-            </w:tcBorders>
-            <w:shd w:val="clear" w:color="auto" w:fill="FFFFFF" w:themeFill="background1"/>
-          </w:tcPr>
-          <w:p>
-            <w:pPr>
-              <w:jc w:val="center"/>
-              <w:rPr>
-                <w:rFonts w:ascii="Times New Roman" w:hAnsi="Times New Roman" w:cs="Times New Roman"/>
-              </w:rPr>
-            </w:pPr>
-            <w:r>
-              <w:rPr>
-                <w:rFonts w:ascii="Times New Roman" w:hAnsi="Times New Roman" w:cs="Times New Roman"/>
-              </w:rPr>
-              <w:t>Date:</w:t>
-            </w:r>
-          </w:p>
-        </w:tc>
-        <w:tc>
-          <w:tcPr>
-            <w:tcW w:w="1980" w:type="dxa"/>
-            <w:tcBorders>
-              <w:left w:val="single" w:sz="4" w:space="0" w:color="auto"/>
-            </w:tcBorders>
-            <w:shd w:val="clear" w:color="auto" w:fill="FFFFFF" w:themeFill="background1"/>
-          </w:tcPr>
-          <w:p>
-            <w:pPr>
-              <w:jc w:val="center"/>
-              <w:rPr>
-                <w:rFonts w:ascii="Times New Roman" w:hAnsi="Times New Roman" w:cs="Times New Roman"/>
-              </w:rPr>
-            </w:pPr>
-            <w:r>
-              <w:rPr>
-                <w:rFonts w:ascii="Times New Roman" w:hAnsi="Times New Roman" w:cs="Times New Roman"/>
-              </w:rPr>
-              <w:t>Commission:</w:t>
-            </w:r>
-          </w:p>
-        </w:tc>
-        <w:tc>
-          <w:tcPr>
-            <w:tcW w:w="1440" w:type="dxa"/>
-            <w:shd w:val="clear" w:color="auto" w:fill="FFFFFF" w:themeFill="background1"/>
-          </w:tcPr>
-          <w:p>
-            <w:pPr>
-              <w:jc w:val="center"/>
-              <w:rPr>
-                <w:rFonts w:ascii="Times New Roman" w:hAnsi="Times New Roman" w:cs="Times New Roman"/>
-              </w:rPr>
-            </w:pPr>
-            <w:r>
-              <w:rPr>
-                <w:rFonts w:ascii="Times New Roman" w:hAnsi="Times New Roman" w:cs="Times New Roman"/>
-              </w:rPr>
-              <w:t>Signature</w:t>
-            </w:r>
-          </w:p>
-        </w:tc>
-      </w:tr>
-      <w:tr>
-        <w:trPr>
-          <w:trHeight w:val="308"/>
-        </w:trPr>
-        <w:tc>
-          <w:tcPr>
-            <w:tcW w:w="1762" w:type="dxa"/>
-            <w:tcBorders>
-              <w:left w:val="single" w:sz="4" w:space="0" w:color="auto"/>
-              <w:right w:val="single" w:sz="4" w:space="0" w:color="auto"/>
-            </w:tcBorders>
-            <w:shd w:val="clear" w:color="auto" w:fill="FFFFFF" w:themeFill="background1"/>
-          </w:tcPr>
-          <w:p>
-            <w:pPr>
-              <w:tabs>
-                <w:tab w:val="left" w:pos="69"/>
-              </w:tabs>
-              <w:ind w:left="-291" w:firstLine="33"/>
-              <w:rPr>
-                <w:rFonts w:ascii="Times New Roman" w:hAnsi="Times New Roman" w:cs="Times New Roman"/>
-              </w:rPr>
-            </w:pPr>
-          </w:p>
-        </w:tc>
-        <w:tc>
-          <w:tcPr>
-            <w:tcW w:w="1980" w:type="dxa"/>
-            <w:tcBorders>
-              <w:left w:val="single" w:sz="4" w:space="0" w:color="auto"/>
-            </w:tcBorders>
-            <w:shd w:val="clear" w:color="auto" w:fill="FFFFFF" w:themeFill="background1"/>
-          </w:tcPr>
-          <w:p>
-            <w:pPr>
-              <w:rPr>
-                <w:rFonts w:ascii="Times New Roman" w:hAnsi="Times New Roman" w:cs="Times New Roman"/>
-              </w:rPr>
-            </w:pPr>
-          </w:p>
-        </w:tc>
-        <w:tc>
-          <w:tcPr>
-            <w:tcW w:w="1440" w:type="dxa"/>
-            <w:shd w:val="clear" w:color="auto" w:fill="FFFFFF" w:themeFill="background1"/>
-          </w:tcPr>
-          <w:p>
-            <w:pPr>
-              <w:rPr>
-                <w:rFonts w:ascii="Times New Roman" w:hAnsi="Times New Roman" w:cs="Times New Roman"/>
-              </w:rPr>
-            </w:pPr>
-          </w:p>
-        </w:tc>
-      </w:tr>
-      <w:tr>
-        <w:trPr>
-          <w:trHeight w:val="43"/>
-        </w:trPr>
-        <w:tc>
-          <w:tcPr>
-            <w:tcW w:w="1762" w:type="dxa"/>
-            <w:tcBorders>
-              <w:left w:val="single" w:sz="4" w:space="0" w:color="auto"/>
-              <w:right w:val="single" w:sz="4" w:space="0" w:color="auto"/>
-            </w:tcBorders>
-            <w:shd w:val="clear" w:color="auto" w:fill="FFFFFF" w:themeFill="background1"/>
-          </w:tcPr>
-          <w:p>
-            <w:pPr>
-              <w:rPr>
-                <w:rFonts w:ascii="Times New Roman" w:hAnsi="Times New Roman" w:cs="Times New Roman"/>
-              </w:rPr>
-            </w:pPr>
-          </w:p>
-        </w:tc>
-        <w:tc>
-          <w:tcPr>
-            <w:tcW w:w="1980" w:type="dxa"/>
-            <w:tcBorders>
-              <w:left w:val="single" w:sz="4" w:space="0" w:color="auto"/>
-            </w:tcBorders>
-            <w:shd w:val="clear" w:color="auto" w:fill="FFFFFF" w:themeFill="background1"/>
-          </w:tcPr>
-          <w:p>
-            <w:pPr>
-              <w:rPr>
-                <w:rFonts w:ascii="Times New Roman" w:hAnsi="Times New Roman" w:cs="Times New Roman"/>
-              </w:rPr>
-            </w:pPr>
-          </w:p>
-        </w:tc>
-        <w:tc>
-          <w:tcPr>
-            <w:tcW w:w="1440" w:type="dxa"/>
-            <w:shd w:val="clear" w:color="auto" w:fill="FFFFFF" w:themeFill="background1"/>
-          </w:tcPr>
-          <w:p>
-            <w:pPr>
-              <w:rPr>
-                <w:rFonts w:ascii="Times New Roman" w:hAnsi="Times New Roman" w:cs="Times New Roman"/>
-              </w:rPr>
-            </w:pPr>
-          </w:p>
-        </w:tc>
-      </w:tr>
-      <w:tr>
-        <w:trPr>
-          <w:trHeight w:val="164"/>
-        </w:trPr>
-        <w:tc>
-          <w:tcPr>
-            <w:tcW w:w="1762" w:type="dxa"/>
-            <w:tcBorders>
-              <w:left w:val="single" w:sz="4" w:space="0" w:color="auto"/>
-              <w:right w:val="nil"/>
-            </w:tcBorders>
-            <w:shd w:val="clear" w:color="auto" w:fill="A8D08D" w:themeFill="accent6" w:themeFillTint="99"/>
-          </w:tcPr>
-          <w:p>
-            <w:pPr>
-              <w:rPr>
-                <w:rFonts w:ascii="Times New Roman" w:hAnsi="Times New Roman" w:cs="Times New Roman"/>
-                <w:b/>
-                <w:bCs/>
-              </w:rPr>
-            </w:pPr>
-            <w:r>
-              <w:rPr>
-                <w:rFonts w:ascii="Times New Roman" w:hAnsi="Times New Roman" w:cs="Times New Roman"/>
-                <w:b/>
-                <w:bCs/>
-              </w:rPr>
-              <w:t>BROKER:</w:t>
-            </w:r>
-          </w:p>
-        </w:tc>
-        <w:tc>
-          <w:tcPr>
-            <w:tcW w:w="3420" w:type="dxa"/>
-            <w:gridSpan w:val="2"/>
-            <w:tcBorders>
-              <w:left w:val="nil"/>
-            </w:tcBorders>
-            <w:shd w:val="clear" w:color="auto" w:fill="FFFFFF" w:themeFill="background1"/>
-          </w:tcPr>
-          <w:p>
-            <w:pPr>
-              <w:rPr>
-                <w:rFonts w:ascii="Times New Roman" w:hAnsi="Times New Roman" w:cs="Times New Roman"/>
-                <w:b/>
-                <w:bCs/>
-              </w:rPr>
-            </w:pPr>
-          </w:p>
-        </w:tc>
-      </w:tr>
-      <w:tr>
-        <w:trPr>
-          <w:trHeight w:val="43"/>
-        </w:trPr>
-        <w:tc>
-          <w:tcPr>
-            <w:tcW w:w="1762" w:type="dxa"/>
-            <w:tcBorders>
-              <w:left w:val="single" w:sz="4" w:space="0" w:color="auto"/>
-              <w:right w:val="single" w:sz="4" w:space="0" w:color="auto"/>
-            </w:tcBorders>
-            <w:shd w:val="clear" w:color="auto" w:fill="FFFFFF" w:themeFill="background1"/>
-          </w:tcPr>
-          <w:p>
-            <w:pPr>
-              <w:rPr>
-                <w:rFonts w:ascii="Times New Roman" w:hAnsi="Times New Roman" w:cs="Times New Roman"/>
-              </w:rPr>
-            </w:pPr>
-          </w:p>
-        </w:tc>
-        <w:tc>
-          <w:tcPr>
-            <w:tcW w:w="1980" w:type="dxa"/>
-            <w:tcBorders>
-              <w:left w:val="single" w:sz="4" w:space="0" w:color="auto"/>
-            </w:tcBorders>
-            <w:shd w:val="clear" w:color="auto" w:fill="FFFFFF" w:themeFill="background1"/>
-          </w:tcPr>
-          <w:p>
-            <w:pPr>
-              <w:rPr>
-                <w:rFonts w:ascii="Times New Roman" w:hAnsi="Times New Roman" w:cs="Times New Roman"/>
-              </w:rPr>
-            </w:pPr>
-          </w:p>
-        </w:tc>
-        <w:tc>
-          <w:tcPr>
-            <w:tcW w:w="1440" w:type="dxa"/>
-            <w:shd w:val="clear" w:color="auto" w:fill="FFFFFF" w:themeFill="background1"/>
-          </w:tcPr>
-          <w:p>
-            <w:pPr>
-              <w:rPr>
-                <w:rFonts w:ascii="Times New Roman" w:hAnsi="Times New Roman" w:cs="Times New Roman"/>
-              </w:rPr>
-            </w:pPr>
-          </w:p>
-        </w:tc>
-      </w:tr>
-      <w:tr>
-        <w:trPr>
-          <w:trHeight w:val="297"/>
-        </w:trPr>
-        <w:tc>
-          <w:tcPr>
-            <w:tcW w:w="1762" w:type="dxa"/>
-            <w:tcBorders>
-              <w:left w:val="single" w:sz="4" w:space="0" w:color="auto"/>
-              <w:right w:val="single" w:sz="4" w:space="0" w:color="auto"/>
-            </w:tcBorders>
-            <w:shd w:val="clear" w:color="auto" w:fill="FFFFFF" w:themeFill="background1"/>
-          </w:tcPr>
-          <w:p>
-            <w:pPr>
-              <w:rPr>
-                <w:rFonts w:ascii="Times New Roman" w:hAnsi="Times New Roman" w:cs="Times New Roman"/>
-              </w:rPr>
-            </w:pPr>
-          </w:p>
-        </w:tc>
-        <w:tc>
-          <w:tcPr>
-            <w:tcW w:w="1980" w:type="dxa"/>
-            <w:tcBorders>
-              <w:left w:val="single" w:sz="4" w:space="0" w:color="auto"/>
-            </w:tcBorders>
-            <w:shd w:val="clear" w:color="auto" w:fill="FFFFFF" w:themeFill="background1"/>
-          </w:tcPr>
-          <w:p>
-            <w:pPr>
-              <w:rPr>
-                <w:rFonts w:ascii="Times New Roman" w:hAnsi="Times New Roman" w:cs="Times New Roman"/>
-              </w:rPr>
-            </w:pPr>
-          </w:p>
-        </w:tc>
-        <w:tc>
-          <w:tcPr>
-            <w:tcW w:w="1440" w:type="dxa"/>
-            <w:shd w:val="clear" w:color="auto" w:fill="FFFFFF" w:themeFill="background1"/>
-          </w:tcPr>
-          <w:p>
-            <w:pPr>
-              <w:rPr>
-                <w:rFonts w:ascii="Times New Roman" w:hAnsi="Times New Roman" w:cs="Times New Roman"/>
-              </w:rPr>
-            </w:pPr>
-          </w:p>
-        </w:tc>
-      </w:tr>
-    </w:tbl>
-    <w:tbl>
-      <w:tblPr>
-        <w:tblStyle w:val="TableGrid"/>
-        <w:tblpPr w:leftFromText="180" w:rightFromText="180" w:vertAnchor="text" w:horzAnchor="margin" w:tblpX="-289" w:tblpY="2300"/>
         <w:tblW w:w="15729" w:type="dxa"/>
         <w:tblLayout w:type="fixed"/>
         <w:tblLook w:val="04A0" w:firstRow="1" w:lastRow="0" w:firstColumn="1" w:lastColumn="0" w:noHBand="0" w:noVBand="1"/>
+        <w:tblInd w:w="-289" w:type="dxa"/>
       </w:tblPr>
       <w:tblGrid>
         <w:gridCol w:w="1413"/>

</xml_diff>